<commit_message>
Add country-by-country tourism MSME needs, interventions and support BSOs
New Section 6.4 applies the capacity-building needs to tourism MSMEs
in the KAZA area of each Partner State. For Angola, Botswana, Namibia,
Zambia and Zimbabwe it gives the local context, a table of needs with
the recommended intervention and delivery mode, the support BSOs (lead
first) and a priority, and the gaps in the country's support BSOs. A
comparison table ranks need areas across the five countries.

Executive summary, chapter 6 intro, Section 10.5 and acronyms updated.

Co-Authored-By: Claude Opus 5.5 <noreply@anthropic.com>
Claude-Session: https://claude.ai/code/session_017hhUVnygzeM59i7YrBzC1m
</commit_message>
<xml_diff>
--- a/KAZA_MSME_Investment_Readiness_Assessment_Narrative.docx
+++ b/KAZA_MSME_Investment_Readiness_Assessment_Narrative.docx
@@ -171,14 +171,14 @@
             </w:rPr>
             <w:fldChar w:fldCharType="separate"/>
           </w:r>
-          <w:hyperlink w:anchor="__RefHeading___Toc1113_4016896087">
+          <w:hyperlink w:anchor="__RefHeading___Toc1251_3920751122">
             <w:r>
               <w:rPr>
                 <w:rStyle w:val="IndexLink"/>
               </w:rPr>
               <w:t>Executive Summary</w:t>
               <w:tab/>
-              <w:t>6</w:t>
+              <w:t>7</w:t>
             </w:r>
           </w:hyperlink>
         </w:p>
@@ -191,72 +191,12 @@
             </w:tabs>
             <w:rPr/>
           </w:pPr>
-          <w:hyperlink w:anchor="__RefHeading___Toc1115_4016896087">
+          <w:hyperlink w:anchor="__RefHeading___Toc1253_3920751122">
             <w:r>
               <w:rPr>
                 <w:rStyle w:val="IndexLink"/>
               </w:rPr>
               <w:t>1. Introduction and Methodology</w:t>
-              <w:tab/>
-              <w:t>9</w:t>
-            </w:r>
-          </w:hyperlink>
-        </w:p>
-        <w:p>
-          <w:pPr>
-            <w:pStyle w:val="TOC2"/>
-            <w:tabs>
-              <w:tab w:val="clear" w:pos="8743"/>
-              <w:tab w:val="right" w:pos="9025" w:leader="dot"/>
-            </w:tabs>
-            <w:rPr/>
-          </w:pPr>
-          <w:hyperlink w:anchor="__RefHeading___Toc1117_4016896087">
-            <w:r>
-              <w:rPr>
-                <w:rStyle w:val="IndexLink"/>
-              </w:rPr>
-              <w:t>1.1 Purpose and Scope</w:t>
-              <w:tab/>
-              <w:t>9</w:t>
-            </w:r>
-          </w:hyperlink>
-        </w:p>
-        <w:p>
-          <w:pPr>
-            <w:pStyle w:val="TOC2"/>
-            <w:tabs>
-              <w:tab w:val="clear" w:pos="8743"/>
-              <w:tab w:val="right" w:pos="9025" w:leader="dot"/>
-            </w:tabs>
-            <w:rPr/>
-          </w:pPr>
-          <w:hyperlink w:anchor="__RefHeading___Toc1119_4016896087">
-            <w:r>
-              <w:rPr>
-                <w:rStyle w:val="IndexLink"/>
-              </w:rPr>
-              <w:t>1.2 Evidence Base</w:t>
-              <w:tab/>
-              <w:t>9</w:t>
-            </w:r>
-          </w:hyperlink>
-        </w:p>
-        <w:p>
-          <w:pPr>
-            <w:pStyle w:val="TOC2"/>
-            <w:tabs>
-              <w:tab w:val="clear" w:pos="8743"/>
-              <w:tab w:val="right" w:pos="9025" w:leader="dot"/>
-            </w:tabs>
-            <w:rPr/>
-          </w:pPr>
-          <w:hyperlink w:anchor="__RefHeading___Toc1121_4016896087">
-            <w:r>
-              <w:rPr>
-                <w:rStyle w:val="IndexLink"/>
-              </w:rPr>
-              <w:t>1.3 Readiness Framework</w:t>
               <w:tab/>
               <w:t>10</w:t>
             </w:r>
@@ -271,14 +211,74 @@
             </w:tabs>
             <w:rPr/>
           </w:pPr>
-          <w:hyperlink w:anchor="__RefHeading___Toc1123_4016896087">
+          <w:hyperlink w:anchor="__RefHeading___Toc1255_3920751122">
+            <w:r>
+              <w:rPr>
+                <w:rStyle w:val="IndexLink"/>
+              </w:rPr>
+              <w:t>1.1 Purpose and Scope</w:t>
+              <w:tab/>
+              <w:t>10</w:t>
+            </w:r>
+          </w:hyperlink>
+        </w:p>
+        <w:p>
+          <w:pPr>
+            <w:pStyle w:val="TOC2"/>
+            <w:tabs>
+              <w:tab w:val="clear" w:pos="8743"/>
+              <w:tab w:val="right" w:pos="9025" w:leader="dot"/>
+            </w:tabs>
+            <w:rPr/>
+          </w:pPr>
+          <w:hyperlink w:anchor="__RefHeading___Toc1257_3920751122">
+            <w:r>
+              <w:rPr>
+                <w:rStyle w:val="IndexLink"/>
+              </w:rPr>
+              <w:t>1.2 Evidence Base</w:t>
+              <w:tab/>
+              <w:t>10</w:t>
+            </w:r>
+          </w:hyperlink>
+        </w:p>
+        <w:p>
+          <w:pPr>
+            <w:pStyle w:val="TOC2"/>
+            <w:tabs>
+              <w:tab w:val="clear" w:pos="8743"/>
+              <w:tab w:val="right" w:pos="9025" w:leader="dot"/>
+            </w:tabs>
+            <w:rPr/>
+          </w:pPr>
+          <w:hyperlink w:anchor="__RefHeading___Toc1259_3920751122">
+            <w:r>
+              <w:rPr>
+                <w:rStyle w:val="IndexLink"/>
+              </w:rPr>
+              <w:t>1.3 Readiness Framework</w:t>
+              <w:tab/>
+              <w:t>11</w:t>
+            </w:r>
+          </w:hyperlink>
+        </w:p>
+        <w:p>
+          <w:pPr>
+            <w:pStyle w:val="TOC2"/>
+            <w:tabs>
+              <w:tab w:val="clear" w:pos="8743"/>
+              <w:tab w:val="right" w:pos="9025" w:leader="dot"/>
+            </w:tabs>
+            <w:rPr/>
+          </w:pPr>
+          <w:hyperlink w:anchor="__RefHeading___Toc1261_3920751122">
             <w:r>
               <w:rPr>
                 <w:rStyle w:val="IndexLink"/>
               </w:rPr>
               <w:t>1.4 Limitations</w:t>
               <w:tab/>
-              <w:t>10</w:t>
+              <w:t>11</w:t>
             </w:r>
           </w:hyperlink>
         </w:p>
@@ -291,14 +291,14 @@
             </w:tabs>
             <w:rPr/>
           </w:pPr>
-          <w:hyperlink w:anchor="__RefHeading___Toc1125_4016896087">
+          <w:hyperlink w:anchor="__RefHeading___Toc1263_3920751122">
             <w:r>
               <w:rPr>
                 <w:rStyle w:val="IndexLink"/>
               </w:rPr>
               <w:t>2. Priority Value Chains and Value Chain Nodes</w:t>
               <w:tab/>
-              <w:t>12</w:t>
+              <w:t>13</w:t>
             </w:r>
           </w:hyperlink>
         </w:p>
@@ -311,14 +311,14 @@
             </w:tabs>
             <w:rPr/>
           </w:pPr>
-          <w:hyperlink w:anchor="__RefHeading___Toc1127_4016896087">
+          <w:hyperlink w:anchor="__RefHeading___Toc1265_3920751122">
             <w:r>
               <w:rPr>
                 <w:rStyle w:val="IndexLink"/>
               </w:rPr>
               <w:t>2.1 The Eight Value Chains</w:t>
               <w:tab/>
-              <w:t>12</w:t>
+              <w:t>13</w:t>
             </w:r>
           </w:hyperlink>
         </w:p>
@@ -331,14 +331,14 @@
             </w:tabs>
             <w:rPr/>
           </w:pPr>
-          <w:hyperlink w:anchor="__RefHeading___Toc1129_4016896087">
+          <w:hyperlink w:anchor="__RefHeading___Toc1267_3920751122">
             <w:r>
               <w:rPr>
                 <w:rStyle w:val="IndexLink"/>
               </w:rPr>
               <w:t>2.2 Value Chain Nodes</w:t>
               <w:tab/>
-              <w:t>13</w:t>
+              <w:t>14</w:t>
             </w:r>
           </w:hyperlink>
         </w:p>
@@ -351,14 +351,14 @@
             </w:tabs>
             <w:rPr/>
           </w:pPr>
-          <w:hyperlink w:anchor="__RefHeading___Toc1131_4016896087">
+          <w:hyperlink w:anchor="__RefHeading___Toc1269_3920751122">
             <w:r>
               <w:rPr>
                 <w:rStyle w:val="IndexLink"/>
               </w:rPr>
               <w:t>3. MSME Business Models</w:t>
               <w:tab/>
-              <w:t>15</w:t>
+              <w:t>16</w:t>
             </w:r>
           </w:hyperlink>
         </w:p>
@@ -371,14 +371,14 @@
             </w:tabs>
             <w:rPr/>
           </w:pPr>
-          <w:hyperlink w:anchor="__RefHeading___Toc1133_4016896087">
+          <w:hyperlink w:anchor="__RefHeading___Toc1271_3920751122">
             <w:r>
               <w:rPr>
                 <w:rStyle w:val="IndexLink"/>
               </w:rPr>
               <w:t>3.1 Common Features</w:t>
               <w:tab/>
-              <w:t>15</w:t>
+              <w:t>16</w:t>
             </w:r>
           </w:hyperlink>
         </w:p>
@@ -391,14 +391,14 @@
             </w:tabs>
             <w:rPr/>
           </w:pPr>
-          <w:hyperlink w:anchor="__RefHeading___Toc1135_4016896087">
+          <w:hyperlink w:anchor="__RefHeading___Toc1273_3920751122">
             <w:r>
               <w:rPr>
                 <w:rStyle w:val="IndexLink"/>
               </w:rPr>
               <w:t>3.2 Business Models by Value Chain</w:t>
               <w:tab/>
-              <w:t>15</w:t>
+              <w:t>16</w:t>
             </w:r>
           </w:hyperlink>
         </w:p>
@@ -411,14 +411,14 @@
             </w:tabs>
             <w:rPr/>
           </w:pPr>
-          <w:hyperlink w:anchor="__RefHeading___Toc1137_4016896087">
+          <w:hyperlink w:anchor="__RefHeading___Toc1275_3920751122">
             <w:r>
               <w:rPr>
                 <w:rStyle w:val="IndexLink"/>
               </w:rPr>
               <w:t>4. Financial Practices, Record-Keeping and Informality</w:t>
               <w:tab/>
-              <w:t>17</w:t>
+              <w:t>18</w:t>
             </w:r>
           </w:hyperlink>
         </w:p>
@@ -431,14 +431,14 @@
             </w:tabs>
             <w:rPr/>
           </w:pPr>
-          <w:hyperlink w:anchor="__RefHeading___Toc1139_4016896087">
+          <w:hyperlink w:anchor="__RefHeading___Toc1277_3920751122">
             <w:r>
               <w:rPr>
                 <w:rStyle w:val="IndexLink"/>
               </w:rPr>
               <w:t>4.1 Financial Practices</w:t>
               <w:tab/>
-              <w:t>17</w:t>
+              <w:t>18</w:t>
             </w:r>
           </w:hyperlink>
         </w:p>
@@ -451,14 +451,14 @@
             </w:tabs>
             <w:rPr/>
           </w:pPr>
-          <w:hyperlink w:anchor="__RefHeading___Toc1141_4016896087">
+          <w:hyperlink w:anchor="__RefHeading___Toc1279_3920751122">
             <w:r>
               <w:rPr>
                 <w:rStyle w:val="IndexLink"/>
               </w:rPr>
               <w:t>4.2 Record-Keeping</w:t>
               <w:tab/>
-              <w:t>17</w:t>
+              <w:t>18</w:t>
             </w:r>
           </w:hyperlink>
         </w:p>
@@ -471,14 +471,14 @@
             </w:tabs>
             <w:rPr/>
           </w:pPr>
-          <w:hyperlink w:anchor="__RefHeading___Toc1143_4016896087">
+          <w:hyperlink w:anchor="__RefHeading___Toc1281_3920751122">
             <w:r>
               <w:rPr>
                 <w:rStyle w:val="IndexLink"/>
               </w:rPr>
               <w:t>4.3 Informality and its Cost</w:t>
               <w:tab/>
-              <w:t>17</w:t>
+              <w:t>18</w:t>
             </w:r>
           </w:hyperlink>
         </w:p>
@@ -491,14 +491,14 @@
             </w:tabs>
             <w:rPr/>
           </w:pPr>
-          <w:hyperlink w:anchor="__RefHeading___Toc1145_4016896087">
+          <w:hyperlink w:anchor="__RefHeading___Toc1283_3920751122">
             <w:r>
               <w:rPr>
                 <w:rStyle w:val="IndexLink"/>
               </w:rPr>
               <w:t>4.4 Readiness by Value Chain</w:t>
               <w:tab/>
-              <w:t>18</w:t>
+              <w:t>19</w:t>
             </w:r>
           </w:hyperlink>
         </w:p>
@@ -511,72 +511,12 @@
             </w:tabs>
             <w:rPr/>
           </w:pPr>
-          <w:hyperlink w:anchor="__RefHeading___Toc1147_4016896087">
+          <w:hyperlink w:anchor="__RefHeading___Toc1285_3920751122">
             <w:r>
               <w:rPr>
                 <w:rStyle w:val="IndexLink"/>
               </w:rPr>
               <w:t>5. Variation by Gender, Age and Value Chain Node</w:t>
-              <w:tab/>
-              <w:t>19</w:t>
-            </w:r>
-          </w:hyperlink>
-        </w:p>
-        <w:p>
-          <w:pPr>
-            <w:pStyle w:val="TOC2"/>
-            <w:tabs>
-              <w:tab w:val="clear" w:pos="8743"/>
-              <w:tab w:val="right" w:pos="9025" w:leader="dot"/>
-            </w:tabs>
-            <w:rPr/>
-          </w:pPr>
-          <w:hyperlink w:anchor="__RefHeading___Toc1149_4016896087">
-            <w:r>
-              <w:rPr>
-                <w:rStyle w:val="IndexLink"/>
-              </w:rPr>
-              <w:t>5.1 What the Evidence Can and Cannot Say</w:t>
-              <w:tab/>
-              <w:t>19</w:t>
-            </w:r>
-          </w:hyperlink>
-        </w:p>
-        <w:p>
-          <w:pPr>
-            <w:pStyle w:val="TOC2"/>
-            <w:tabs>
-              <w:tab w:val="clear" w:pos="8743"/>
-              <w:tab w:val="right" w:pos="9025" w:leader="dot"/>
-            </w:tabs>
-            <w:rPr/>
-          </w:pPr>
-          <w:hyperlink w:anchor="__RefHeading___Toc1151_4016896087">
-            <w:r>
-              <w:rPr>
-                <w:rStyle w:val="IndexLink"/>
-              </w:rPr>
-              <w:t>5.2 Gender</w:t>
-              <w:tab/>
-              <w:t>19</w:t>
-            </w:r>
-          </w:hyperlink>
-        </w:p>
-        <w:p>
-          <w:pPr>
-            <w:pStyle w:val="TOC2"/>
-            <w:tabs>
-              <w:tab w:val="clear" w:pos="8743"/>
-              <w:tab w:val="right" w:pos="9025" w:leader="dot"/>
-            </w:tabs>
-            <w:rPr/>
-          </w:pPr>
-          <w:hyperlink w:anchor="__RefHeading___Toc1153_4016896087">
-            <w:r>
-              <w:rPr>
-                <w:rStyle w:val="IndexLink"/>
-              </w:rPr>
-              <w:t>5.3 Age</w:t>
               <w:tab/>
               <w:t>20</w:t>
             </w:r>
@@ -591,12 +531,12 @@
             </w:tabs>
             <w:rPr/>
           </w:pPr>
-          <w:hyperlink w:anchor="__RefHeading___Toc1155_4016896087">
+          <w:hyperlink w:anchor="__RefHeading___Toc1287_3920751122">
             <w:r>
               <w:rPr>
                 <w:rStyle w:val="IndexLink"/>
               </w:rPr>
-              <w:t>5.4 Value Chain Node</w:t>
+              <w:t>5.1 What the Evidence Can and Cannot Say</w:t>
               <w:tab/>
               <w:t>20</w:t>
             </w:r>
@@ -604,19 +544,39 @@
         </w:p>
         <w:p>
           <w:pPr>
-            <w:pStyle w:val="TOC1"/>
+            <w:pStyle w:val="TOC2"/>
             <w:tabs>
-              <w:tab w:val="clear" w:pos="9026"/>
+              <w:tab w:val="clear" w:pos="8743"/>
               <w:tab w:val="right" w:pos="9025" w:leader="dot"/>
             </w:tabs>
             <w:rPr/>
           </w:pPr>
-          <w:hyperlink w:anchor="__RefHeading___Toc1157_4016896087">
+          <w:hyperlink w:anchor="__RefHeading___Toc1289_3920751122">
             <w:r>
               <w:rPr>
                 <w:rStyle w:val="IndexLink"/>
               </w:rPr>
-              <w:t>6. Capacity-Building Needs</w:t>
+              <w:t>5.2 Gender</w:t>
+              <w:tab/>
+              <w:t>20</w:t>
+            </w:r>
+          </w:hyperlink>
+        </w:p>
+        <w:p>
+          <w:pPr>
+            <w:pStyle w:val="TOC2"/>
+            <w:tabs>
+              <w:tab w:val="clear" w:pos="8743"/>
+              <w:tab w:val="right" w:pos="9025" w:leader="dot"/>
+            </w:tabs>
+            <w:rPr/>
+          </w:pPr>
+          <w:hyperlink w:anchor="__RefHeading___Toc1291_3920751122">
+            <w:r>
+              <w:rPr>
+                <w:rStyle w:val="IndexLink"/>
+              </w:rPr>
+              <w:t>5.3 Age</w:t>
               <w:tab/>
               <w:t>21</w:t>
             </w:r>
@@ -631,14 +591,34 @@
             </w:tabs>
             <w:rPr/>
           </w:pPr>
-          <w:hyperlink w:anchor="__RefHeading___Toc1159_4016896087">
+          <w:hyperlink w:anchor="__RefHeading___Toc1293_3920751122">
             <w:r>
               <w:rPr>
                 <w:rStyle w:val="IndexLink"/>
               </w:rPr>
-              <w:t>6.1 MSMEs</w:t>
+              <w:t>5.4 Value Chain Node</w:t>
               <w:tab/>
               <w:t>21</w:t>
+            </w:r>
+          </w:hyperlink>
+        </w:p>
+        <w:p>
+          <w:pPr>
+            <w:pStyle w:val="TOC1"/>
+            <w:tabs>
+              <w:tab w:val="clear" w:pos="9026"/>
+              <w:tab w:val="right" w:pos="9025" w:leader="dot"/>
+            </w:tabs>
+            <w:rPr/>
+          </w:pPr>
+          <w:hyperlink w:anchor="__RefHeading___Toc1295_3920751122">
+            <w:r>
+              <w:rPr>
+                <w:rStyle w:val="IndexLink"/>
+              </w:rPr>
+              <w:t>6. Capacity-Building Needs</w:t>
+              <w:tab/>
+              <w:t>22</w:t>
             </w:r>
           </w:hyperlink>
         </w:p>
@@ -651,14 +631,14 @@
             </w:tabs>
             <w:rPr/>
           </w:pPr>
-          <w:hyperlink w:anchor="__RefHeading___Toc1161_4016896087">
+          <w:hyperlink w:anchor="__RefHeading___Toc1297_3920751122">
             <w:r>
               <w:rPr>
                 <w:rStyle w:val="IndexLink"/>
               </w:rPr>
-              <w:t>6.2 Business Support Organisations</w:t>
+              <w:t>6.1 MSMEs</w:t>
               <w:tab/>
-              <w:t>24</w:t>
+              <w:t>22</w:t>
             </w:r>
           </w:hyperlink>
         </w:p>
@@ -671,14 +651,54 @@
             </w:tabs>
             <w:rPr/>
           </w:pPr>
-          <w:hyperlink w:anchor="__RefHeading___Toc1163_4016896087">
+          <w:hyperlink w:anchor="__RefHeading___Toc1299_3920751122">
+            <w:r>
+              <w:rPr>
+                <w:rStyle w:val="IndexLink"/>
+              </w:rPr>
+              <w:t>6.2 Business Support Organisations</w:t>
+              <w:tab/>
+              <w:t>25</w:t>
+            </w:r>
+          </w:hyperlink>
+        </w:p>
+        <w:p>
+          <w:pPr>
+            <w:pStyle w:val="TOC2"/>
+            <w:tabs>
+              <w:tab w:val="clear" w:pos="8743"/>
+              <w:tab w:val="right" w:pos="9025" w:leader="dot"/>
+            </w:tabs>
+            <w:rPr/>
+          </w:pPr>
+          <w:hyperlink w:anchor="__RefHeading___Toc1301_3920751122">
             <w:r>
               <w:rPr>
                 <w:rStyle w:val="IndexLink"/>
               </w:rPr>
               <w:t>6.3 Financial Institutions</w:t>
               <w:tab/>
-              <w:t>27</w:t>
+              <w:t>28</w:t>
+            </w:r>
+          </w:hyperlink>
+        </w:p>
+        <w:p>
+          <w:pPr>
+            <w:pStyle w:val="TOC2"/>
+            <w:tabs>
+              <w:tab w:val="clear" w:pos="8743"/>
+              <w:tab w:val="right" w:pos="9025" w:leader="dot"/>
+            </w:tabs>
+            <w:rPr/>
+          </w:pPr>
+          <w:hyperlink w:anchor="__RefHeading___Toc1303_3920751122">
+            <w:r>
+              <w:rPr>
+                <w:rStyle w:val="IndexLink"/>
+              </w:rPr>
+              <w:t>6.4 Tourism MSME Needs, Interventions and Support BSOs by Country</w:t>
+              <w:tab/>
+              <w:t>29</w:t>
             </w:r>
           </w:hyperlink>
         </w:p>
@@ -691,14 +711,14 @@
             </w:tabs>
             <w:rPr/>
           </w:pPr>
-          <w:hyperlink w:anchor="__RefHeading___Toc1165_4016896087">
+          <w:hyperlink w:anchor="__RefHeading___Toc1305_3920751122">
             <w:r>
               <w:rPr>
                 <w:rStyle w:val="IndexLink"/>
               </w:rPr>
               <w:t>7. Enabling Environment</w:t>
               <w:tab/>
-              <w:t>29</w:t>
+              <w:t>34</w:t>
             </w:r>
           </w:hyperlink>
         </w:p>
@@ -711,14 +731,14 @@
             </w:tabs>
             <w:rPr/>
           </w:pPr>
-          <w:hyperlink w:anchor="__RefHeading___Toc1167_4016896087">
+          <w:hyperlink w:anchor="__RefHeading___Toc1307_3920751122">
             <w:r>
               <w:rPr>
                 <w:rStyle w:val="IndexLink"/>
               </w:rPr>
               <w:t>7.1 National and Regional Regulatory Frameworks</w:t>
               <w:tab/>
-              <w:t>29</w:t>
+              <w:t>34</w:t>
             </w:r>
           </w:hyperlink>
         </w:p>
@@ -731,72 +751,12 @@
             </w:tabs>
             <w:rPr/>
           </w:pPr>
-          <w:hyperlink w:anchor="__RefHeading___Toc1169_4016896087">
+          <w:hyperlink w:anchor="__RefHeading___Toc1309_3920751122">
             <w:r>
               <w:rPr>
                 <w:rStyle w:val="IndexLink"/>
               </w:rPr>
               <w:t>7.2 Market Access and Linkages with Larger Operators</w:t>
-              <w:tab/>
-              <w:t>33</w:t>
-            </w:r>
-          </w:hyperlink>
-        </w:p>
-        <w:p>
-          <w:pPr>
-            <w:pStyle w:val="TOC2"/>
-            <w:tabs>
-              <w:tab w:val="clear" w:pos="8743"/>
-              <w:tab w:val="right" w:pos="9025" w:leader="dot"/>
-            </w:tabs>
-            <w:rPr/>
-          </w:pPr>
-          <w:hyperlink w:anchor="__RefHeading___Toc1171_4016896087">
-            <w:r>
-              <w:rPr>
-                <w:rStyle w:val="IndexLink"/>
-              </w:rPr>
-              <w:t>7.3 Business Development Services</w:t>
-              <w:tab/>
-              <w:t>35</w:t>
-            </w:r>
-          </w:hyperlink>
-        </w:p>
-        <w:p>
-          <w:pPr>
-            <w:pStyle w:val="TOC2"/>
-            <w:tabs>
-              <w:tab w:val="clear" w:pos="8743"/>
-              <w:tab w:val="right" w:pos="9025" w:leader="dot"/>
-            </w:tabs>
-            <w:rPr/>
-          </w:pPr>
-          <w:hyperlink w:anchor="__RefHeading___Toc1173_4016896087">
-            <w:r>
-              <w:rPr>
-                <w:rStyle w:val="IndexLink"/>
-              </w:rPr>
-              <w:t>7.4 Policy Conditions</w:t>
-              <w:tab/>
-              <w:t>37</w:t>
-            </w:r>
-          </w:hyperlink>
-        </w:p>
-        <w:p>
-          <w:pPr>
-            <w:pStyle w:val="TOC1"/>
-            <w:tabs>
-              <w:tab w:val="clear" w:pos="9026"/>
-              <w:tab w:val="right" w:pos="9025" w:leader="dot"/>
-            </w:tabs>
-            <w:rPr/>
-          </w:pPr>
-          <w:hyperlink w:anchor="__RefHeading___Toc1175_4016896087">
-            <w:r>
-              <w:rPr>
-                <w:rStyle w:val="IndexLink"/>
-              </w:rPr>
-              <w:t>8. Readiness for Financial Products</w:t>
               <w:tab/>
               <w:t>38</w:t>
             </w:r>
@@ -811,14 +771,14 @@
             </w:tabs>
             <w:rPr/>
           </w:pPr>
-          <w:hyperlink w:anchor="__RefHeading___Toc1177_4016896087">
+          <w:hyperlink w:anchor="__RefHeading___Toc1311_3920751122">
             <w:r>
               <w:rPr>
                 <w:rStyle w:val="IndexLink"/>
               </w:rPr>
-              <w:t>8.1 The Effect of Seasonality on Debt</w:t>
+              <w:t>7.3 Business Development Services</w:t>
               <w:tab/>
-              <w:t>38</w:t>
+              <w:t>40</w:t>
             </w:r>
           </w:hyperlink>
         </w:p>
@@ -831,34 +791,14 @@
             </w:tabs>
             <w:rPr/>
           </w:pPr>
-          <w:hyperlink w:anchor="__RefHeading___Toc1179_4016896087">
+          <w:hyperlink w:anchor="__RefHeading___Toc1313_3920751122">
             <w:r>
               <w:rPr>
                 <w:rStyle w:val="IndexLink"/>
               </w:rPr>
-              <w:t>8.2 MSME Readiness by Product</w:t>
+              <w:t>7.4 Policy Conditions</w:t>
               <w:tab/>
-              <w:t>38</w:t>
-            </w:r>
-          </w:hyperlink>
-        </w:p>
-        <w:p>
-          <w:pPr>
-            <w:pStyle w:val="TOC2"/>
-            <w:tabs>
-              <w:tab w:val="clear" w:pos="8743"/>
-              <w:tab w:val="right" w:pos="9025" w:leader="dot"/>
-            </w:tabs>
-            <w:rPr/>
-          </w:pPr>
-          <w:hyperlink w:anchor="__RefHeading___Toc1181_4016896087">
-            <w:r>
-              <w:rPr>
-                <w:rStyle w:val="IndexLink"/>
-              </w:rPr>
-              <w:t>8.3 Financial Institution Readiness by Product</w:t>
-              <w:tab/>
-              <w:t>39</w:t>
+              <w:t>42</w:t>
             </w:r>
           </w:hyperlink>
         </w:p>
@@ -871,92 +811,12 @@
             </w:tabs>
             <w:rPr/>
           </w:pPr>
-          <w:hyperlink w:anchor="__RefHeading___Toc1183_4016896087">
+          <w:hyperlink w:anchor="__RefHeading___Toc1315_3920751122">
             <w:r>
               <w:rPr>
                 <w:rStyle w:val="IndexLink"/>
               </w:rPr>
-              <w:t>9. Scalable Women- and Youth-Led Models</w:t>
-              <w:tab/>
-              <w:t>40</w:t>
-            </w:r>
-          </w:hyperlink>
-        </w:p>
-        <w:p>
-          <w:pPr>
-            <w:pStyle w:val="TOC1"/>
-            <w:tabs>
-              <w:tab w:val="clear" w:pos="9026"/>
-              <w:tab w:val="right" w:pos="9025" w:leader="dot"/>
-            </w:tabs>
-            <w:rPr/>
-          </w:pPr>
-          <w:hyperlink w:anchor="__RefHeading___Toc1185_4016896087">
-            <w:r>
-              <w:rPr>
-                <w:rStyle w:val="IndexLink"/>
-              </w:rPr>
-              <w:t>10. Recommended Capacity-Building Interventions</w:t>
-              <w:tab/>
-              <w:t>42</w:t>
-            </w:r>
-          </w:hyperlink>
-        </w:p>
-        <w:p>
-          <w:pPr>
-            <w:pStyle w:val="TOC2"/>
-            <w:tabs>
-              <w:tab w:val="clear" w:pos="8743"/>
-              <w:tab w:val="right" w:pos="9025" w:leader="dot"/>
-            </w:tabs>
-            <w:rPr/>
-          </w:pPr>
-          <w:hyperlink w:anchor="__RefHeading___Toc1187_4016896087">
-            <w:r>
-              <w:rPr>
-                <w:rStyle w:val="IndexLink"/>
-              </w:rPr>
-              <w:t>10.1 A Tiered Readiness Pathway</w:t>
-              <w:tab/>
-              <w:t>42</w:t>
-            </w:r>
-          </w:hyperlink>
-        </w:p>
-        <w:p>
-          <w:pPr>
-            <w:pStyle w:val="TOC2"/>
-            <w:tabs>
-              <w:tab w:val="clear" w:pos="8743"/>
-              <w:tab w:val="right" w:pos="9025" w:leader="dot"/>
-            </w:tabs>
-            <w:rPr/>
-          </w:pPr>
-          <w:hyperlink w:anchor="__RefHeading___Toc1189_4016896087">
-            <w:r>
-              <w:rPr>
-                <w:rStyle w:val="IndexLink"/>
-              </w:rPr>
-              <w:t>10.2 Gender-Transformative Approaches</w:t>
-              <w:tab/>
-              <w:t>42</w:t>
-            </w:r>
-          </w:hyperlink>
-        </w:p>
-        <w:p>
-          <w:pPr>
-            <w:pStyle w:val="TOC2"/>
-            <w:tabs>
-              <w:tab w:val="clear" w:pos="8743"/>
-              <w:tab w:val="right" w:pos="9025" w:leader="dot"/>
-            </w:tabs>
-            <w:rPr/>
-          </w:pPr>
-          <w:hyperlink w:anchor="__RefHeading___Toc1191_4016896087">
-            <w:r>
-              <w:rPr>
-                <w:rStyle w:val="IndexLink"/>
-              </w:rPr>
-              <w:t>10.3 Youth-Focused Incubation</w:t>
+              <w:t>8. Readiness for Financial Products</w:t>
               <w:tab/>
               <w:t>43</w:t>
             </w:r>
@@ -971,12 +831,12 @@
             </w:tabs>
             <w:rPr/>
           </w:pPr>
-          <w:hyperlink w:anchor="__RefHeading___Toc1193_4016896087">
+          <w:hyperlink w:anchor="__RefHeading___Toc1317_3920751122">
             <w:r>
               <w:rPr>
                 <w:rStyle w:val="IndexLink"/>
               </w:rPr>
-              <w:t>10.4 Blended Support Packages</w:t>
+              <w:t>8.1 The Effect of Seasonality on Debt</w:t>
               <w:tab/>
               <w:t>43</w:t>
             </w:r>
@@ -991,12 +851,12 @@
             </w:tabs>
             <w:rPr/>
           </w:pPr>
-          <w:hyperlink w:anchor="__RefHeading___Toc1195_4016896087">
+          <w:hyperlink w:anchor="__RefHeading___Toc1319_3920751122">
             <w:r>
               <w:rPr>
                 <w:rStyle w:val="IndexLink"/>
               </w:rPr>
-              <w:t>10.5 BSO Strengthening</w:t>
+              <w:t>8.2 MSME Readiness by Product</w:t>
               <w:tab/>
               <w:t>43</w:t>
             </w:r>
@@ -1011,14 +871,54 @@
             </w:tabs>
             <w:rPr/>
           </w:pPr>
-          <w:hyperlink w:anchor="__RefHeading___Toc1197_4016896087">
+          <w:hyperlink w:anchor="__RefHeading___Toc1321_3920751122">
             <w:r>
               <w:rPr>
                 <w:rStyle w:val="IndexLink"/>
               </w:rPr>
-              <w:t>10.6 Financial Institution Strengthening</w:t>
+              <w:t>8.3 Financial Institution Readiness by Product</w:t>
               <w:tab/>
               <w:t>44</w:t>
+            </w:r>
+          </w:hyperlink>
+        </w:p>
+        <w:p>
+          <w:pPr>
+            <w:pStyle w:val="TOC1"/>
+            <w:tabs>
+              <w:tab w:val="clear" w:pos="9026"/>
+              <w:tab w:val="right" w:pos="9025" w:leader="dot"/>
+            </w:tabs>
+            <w:rPr/>
+          </w:pPr>
+          <w:hyperlink w:anchor="__RefHeading___Toc1323_3920751122">
+            <w:r>
+              <w:rPr>
+                <w:rStyle w:val="IndexLink"/>
+              </w:rPr>
+              <w:t>9. Scalable Women- and Youth-Led Models</w:t>
+              <w:tab/>
+              <w:t>45</w:t>
+            </w:r>
+          </w:hyperlink>
+        </w:p>
+        <w:p>
+          <w:pPr>
+            <w:pStyle w:val="TOC1"/>
+            <w:tabs>
+              <w:tab w:val="clear" w:pos="9026"/>
+              <w:tab w:val="right" w:pos="9025" w:leader="dot"/>
+            </w:tabs>
+            <w:rPr/>
+          </w:pPr>
+          <w:hyperlink w:anchor="__RefHeading___Toc1325_3920751122">
+            <w:r>
+              <w:rPr>
+                <w:rStyle w:val="IndexLink"/>
+              </w:rPr>
+              <w:t>10. Recommended Capacity-Building Interventions</w:t>
+              <w:tab/>
+              <w:t>47</w:t>
             </w:r>
           </w:hyperlink>
         </w:p>
@@ -1031,14 +931,14 @@
             </w:tabs>
             <w:rPr/>
           </w:pPr>
-          <w:hyperlink w:anchor="__RefHeading___Toc1199_4016896087">
+          <w:hyperlink w:anchor="__RefHeading___Toc1327_3920751122">
             <w:r>
               <w:rPr>
                 <w:rStyle w:val="IndexLink"/>
               </w:rPr>
-              <w:t>10.7 Enabling Environment and Market Linkage Actions</w:t>
+              <w:t>10.1 A Tiered Readiness Pathway</w:t>
               <w:tab/>
-              <w:t>45</w:t>
+              <w:t>47</w:t>
             </w:r>
           </w:hyperlink>
         </w:p>
@@ -1051,14 +951,14 @@
             </w:tabs>
             <w:rPr/>
           </w:pPr>
-          <w:hyperlink w:anchor="__RefHeading___Toc1201_4016896087">
+          <w:hyperlink w:anchor="__RefHeading___Toc1329_3920751122">
             <w:r>
               <w:rPr>
                 <w:rStyle w:val="IndexLink"/>
               </w:rPr>
-              <w:t>10.8 Pathways to Financing</w:t>
+              <w:t>10.2 Gender-Transformative Approaches</w:t>
               <w:tab/>
-              <w:t>45</w:t>
+              <w:t>47</w:t>
             </w:r>
           </w:hyperlink>
         </w:p>
@@ -1071,14 +971,134 @@
             </w:tabs>
             <w:rPr/>
           </w:pPr>
-          <w:hyperlink w:anchor="__RefHeading___Toc1203_4016896087">
+          <w:hyperlink w:anchor="__RefHeading___Toc1331_3920751122">
+            <w:r>
+              <w:rPr>
+                <w:rStyle w:val="IndexLink"/>
+              </w:rPr>
+              <w:t>10.3 Youth-Focused Incubation</w:t>
+              <w:tab/>
+              <w:t>48</w:t>
+            </w:r>
+          </w:hyperlink>
+        </w:p>
+        <w:p>
+          <w:pPr>
+            <w:pStyle w:val="TOC2"/>
+            <w:tabs>
+              <w:tab w:val="clear" w:pos="8743"/>
+              <w:tab w:val="right" w:pos="9025" w:leader="dot"/>
+            </w:tabs>
+            <w:rPr/>
+          </w:pPr>
+          <w:hyperlink w:anchor="__RefHeading___Toc1333_3920751122">
+            <w:r>
+              <w:rPr>
+                <w:rStyle w:val="IndexLink"/>
+              </w:rPr>
+              <w:t>10.4 Blended Support Packages</w:t>
+              <w:tab/>
+              <w:t>48</w:t>
+            </w:r>
+          </w:hyperlink>
+        </w:p>
+        <w:p>
+          <w:pPr>
+            <w:pStyle w:val="TOC2"/>
+            <w:tabs>
+              <w:tab w:val="clear" w:pos="8743"/>
+              <w:tab w:val="right" w:pos="9025" w:leader="dot"/>
+            </w:tabs>
+            <w:rPr/>
+          </w:pPr>
+          <w:hyperlink w:anchor="__RefHeading___Toc1335_3920751122">
+            <w:r>
+              <w:rPr>
+                <w:rStyle w:val="IndexLink"/>
+              </w:rPr>
+              <w:t>10.5 BSO Strengthening</w:t>
+              <w:tab/>
+              <w:t>48</w:t>
+            </w:r>
+          </w:hyperlink>
+        </w:p>
+        <w:p>
+          <w:pPr>
+            <w:pStyle w:val="TOC2"/>
+            <w:tabs>
+              <w:tab w:val="clear" w:pos="8743"/>
+              <w:tab w:val="right" w:pos="9025" w:leader="dot"/>
+            </w:tabs>
+            <w:rPr/>
+          </w:pPr>
+          <w:hyperlink w:anchor="__RefHeading___Toc1337_3920751122">
+            <w:r>
+              <w:rPr>
+                <w:rStyle w:val="IndexLink"/>
+              </w:rPr>
+              <w:t>10.6 Financial Institution Strengthening</w:t>
+              <w:tab/>
+              <w:t>49</w:t>
+            </w:r>
+          </w:hyperlink>
+        </w:p>
+        <w:p>
+          <w:pPr>
+            <w:pStyle w:val="TOC2"/>
+            <w:tabs>
+              <w:tab w:val="clear" w:pos="8743"/>
+              <w:tab w:val="right" w:pos="9025" w:leader="dot"/>
+            </w:tabs>
+            <w:rPr/>
+          </w:pPr>
+          <w:hyperlink w:anchor="__RefHeading___Toc1339_3920751122">
+            <w:r>
+              <w:rPr>
+                <w:rStyle w:val="IndexLink"/>
+              </w:rPr>
+              <w:t>10.7 Enabling Environment and Market Linkage Actions</w:t>
+              <w:tab/>
+              <w:t>50</w:t>
+            </w:r>
+          </w:hyperlink>
+        </w:p>
+        <w:p>
+          <w:pPr>
+            <w:pStyle w:val="TOC2"/>
+            <w:tabs>
+              <w:tab w:val="clear" w:pos="8743"/>
+              <w:tab w:val="right" w:pos="9025" w:leader="dot"/>
+            </w:tabs>
+            <w:rPr/>
+          </w:pPr>
+          <w:hyperlink w:anchor="__RefHeading___Toc1341_3920751122">
+            <w:r>
+              <w:rPr>
+                <w:rStyle w:val="IndexLink"/>
+              </w:rPr>
+              <w:t>10.8 Pathways to Financing</w:t>
+              <w:tab/>
+              <w:t>50</w:t>
+            </w:r>
+          </w:hyperlink>
+        </w:p>
+        <w:p>
+          <w:pPr>
+            <w:pStyle w:val="TOC2"/>
+            <w:tabs>
+              <w:tab w:val="clear" w:pos="8743"/>
+              <w:tab w:val="right" w:pos="9025" w:leader="dot"/>
+            </w:tabs>
+            <w:rPr/>
+          </w:pPr>
+          <w:hyperlink w:anchor="__RefHeading___Toc1343_3920751122">
             <w:r>
               <w:rPr>
                 <w:rStyle w:val="IndexLink"/>
               </w:rPr>
               <w:t>10.9 Priorities and Next Steps</w:t>
               <w:tab/>
-              <w:t>46</w:t>
+              <w:t>51</w:t>
             </w:r>
           </w:hyperlink>
         </w:p>
@@ -1091,14 +1111,14 @@
             </w:tabs>
             <w:rPr/>
           </w:pPr>
-          <w:hyperlink w:anchor="__RefHeading___Toc1205_4016896087">
+          <w:hyperlink w:anchor="__RefHeading___Toc1345_3920751122">
             <w:r>
               <w:rPr>
                 <w:rStyle w:val="IndexLink"/>
               </w:rPr>
               <w:t>Annex A: Evidence Map</w:t>
               <w:tab/>
-              <w:t>47</w:t>
+              <w:t>52</w:t>
             </w:r>
           </w:hyperlink>
         </w:p>
@@ -1111,14 +1131,14 @@
             </w:tabs>
             <w:rPr/>
           </w:pPr>
-          <w:hyperlink w:anchor="__RefHeading___Toc1207_4016896087">
+          <w:hyperlink w:anchor="__RefHeading___Toc1347_3920751122">
             <w:r>
               <w:rPr>
                 <w:rStyle w:val="IndexLink"/>
               </w:rPr>
               <w:t>Annex B: Closing the Gender and Age Data Gap</w:t>
               <w:tab/>
-              <w:t>48</w:t>
+              <w:t>53</w:t>
             </w:r>
           </w:hyperlink>
         </w:p>
@@ -1131,14 +1151,14 @@
             </w:tabs>
             <w:rPr/>
           </w:pPr>
-          <w:hyperlink w:anchor="__RefHeading___Toc1209_4016896087">
+          <w:hyperlink w:anchor="__RefHeading___Toc1349_3920751122">
             <w:r>
               <w:rPr>
                 <w:rStyle w:val="IndexLink"/>
               </w:rPr>
               <w:t>References</w:t>
               <w:tab/>
-              <w:t>49</w:t>
+              <w:t>54</w:t>
             </w:r>
           </w:hyperlink>
           <w:r>
@@ -1542,12 +1562,12 @@
           <w:b/>
           <w:bCs/>
         </w:rPr>
-        <w:t>BOTA</w:t>
+        <w:t>BOCOBONET</w:t>
       </w:r>
       <w:r>
         <w:rPr/>
         <w:tab/>
-        <w:t>Botswana Training Authority</w:t>
+        <w:t>Botswana Community Based Organisations Network</w:t>
       </w:r>
     </w:p>
     <w:p>
@@ -1566,12 +1586,12 @@
           <w:b/>
           <w:bCs/>
         </w:rPr>
-        <w:t>BRRA</w:t>
+        <w:t>BOTA</w:t>
       </w:r>
       <w:r>
         <w:rPr/>
         <w:tab/>
-        <w:t>Business Regulatory Review Agency (Zambia)</w:t>
+        <w:t>Botswana Training Authority</w:t>
       </w:r>
     </w:p>
     <w:p>
@@ -1590,12 +1610,12 @@
           <w:b/>
           <w:bCs/>
         </w:rPr>
-        <w:t>BSO</w:t>
+        <w:t>BRRA</w:t>
       </w:r>
       <w:r>
         <w:rPr/>
         <w:tab/>
-        <w:t>Business support organisation</w:t>
+        <w:t>Business Regulatory Review Agency (Zambia)</w:t>
       </w:r>
     </w:p>
     <w:p>
@@ -1614,12 +1634,12 @@
           <w:b/>
           <w:bCs/>
         </w:rPr>
-        <w:t>BTO</w:t>
+        <w:t>BSO</w:t>
       </w:r>
       <w:r>
         <w:rPr/>
         <w:tab/>
-        <w:t>Botswana Tourism Organisation</w:t>
+        <w:t>Business support organisation</w:t>
       </w:r>
     </w:p>
     <w:p>
@@ -1638,12 +1658,12 @@
           <w:b/>
           <w:bCs/>
         </w:rPr>
-        <w:t>BUE</w:t>
+        <w:t>BTO</w:t>
       </w:r>
       <w:r>
         <w:rPr/>
         <w:tab/>
-        <w:t>Balcão Único do Empreendedor (Angola)</w:t>
+        <w:t>Botswana Tourism Organisation</w:t>
       </w:r>
     </w:p>
     <w:p>
@@ -1662,12 +1682,12 @@
           <w:b/>
           <w:bCs/>
         </w:rPr>
-        <w:t>BWP</w:t>
+        <w:t>BUE</w:t>
       </w:r>
       <w:r>
         <w:rPr/>
         <w:tab/>
-        <w:t>Botswana pula</w:t>
+        <w:t>Balcão Único do Empreendedor (Angola)</w:t>
       </w:r>
     </w:p>
     <w:p>
@@ -1686,12 +1706,12 @@
           <w:b/>
           <w:bCs/>
         </w:rPr>
-        <w:t>CAMPFIRE</w:t>
+        <w:t>BWP</w:t>
       </w:r>
       <w:r>
         <w:rPr/>
         <w:tab/>
-        <w:t>Communal Areas Management Programme for Indigenous Resources (Zimbabwe)</w:t>
+        <w:t>Botswana pula</w:t>
       </w:r>
     </w:p>
     <w:p>
@@ -1710,12 +1730,12 @@
           <w:b/>
           <w:bCs/>
         </w:rPr>
-        <w:t>CBNRM</w:t>
+        <w:t>CAMPFIRE</w:t>
       </w:r>
       <w:r>
         <w:rPr/>
         <w:tab/>
-        <w:t>Community-based natural resource management</w:t>
+        <w:t>Communal Areas Management Programme for Indigenous Resources (Zimbabwe)</w:t>
       </w:r>
     </w:p>
     <w:p>
@@ -1734,12 +1754,12 @@
           <w:b/>
           <w:bCs/>
         </w:rPr>
-        <w:t>CBO</w:t>
+        <w:t>CBNRM</w:t>
       </w:r>
       <w:r>
         <w:rPr/>
         <w:tab/>
-        <w:t>Community-based organisation</w:t>
+        <w:t>Community-based natural resource management</w:t>
       </w:r>
     </w:p>
     <w:p>
@@ -1758,12 +1778,12 @@
           <w:b/>
           <w:bCs/>
         </w:rPr>
-        <w:t>CDE</w:t>
+        <w:t>CBO</w:t>
       </w:r>
       <w:r>
         <w:rPr/>
         <w:tab/>
-        <w:t>Centre for the Development of Enterprise (ACP-EU)</w:t>
+        <w:t>Community-based organisation</w:t>
       </w:r>
     </w:p>
     <w:p>
@@ -1782,12 +1802,12 @@
           <w:b/>
           <w:bCs/>
         </w:rPr>
-        <w:t>CEDA</w:t>
+        <w:t>CCFN</w:t>
       </w:r>
       <w:r>
         <w:rPr/>
         <w:tab/>
-        <w:t>Citizen Entrepreneurial Development Agency (Botswana)</w:t>
+        <w:t>Community Conservation Fund of Namibia</w:t>
       </w:r>
     </w:p>
     <w:p>
@@ -1806,12 +1826,12 @@
           <w:b/>
           <w:bCs/>
         </w:rPr>
-        <w:t>CEEC</w:t>
+        <w:t>CCIA</w:t>
       </w:r>
       <w:r>
         <w:rPr/>
         <w:tab/>
-        <w:t>Citizens Economic Empowerment Commission (Zambia)</w:t>
+        <w:t>Câmara de Comércio e Indústria de Angola</w:t>
       </w:r>
     </w:p>
     <w:p>
@@ -1830,12 +1850,12 @@
           <w:b/>
           <w:bCs/>
         </w:rPr>
-        <w:t>CGS</w:t>
+        <w:t>CDE</w:t>
       </w:r>
       <w:r>
         <w:rPr/>
         <w:tab/>
-        <w:t>Credit Guarantee Scheme (Namibia)</w:t>
+        <w:t>Centre for the Development of Enterprise (ACP-EU)</w:t>
       </w:r>
     </w:p>
     <w:p>
@@ -1854,12 +1874,12 @@
           <w:b/>
           <w:bCs/>
         </w:rPr>
-        <w:t>CIPA</w:t>
+        <w:t>CEDA</w:t>
       </w:r>
       <w:r>
         <w:rPr/>
         <w:tab/>
-        <w:t>Companies and Intellectual Property Authority (Botswana)</w:t>
+        <w:t>Citizen Entrepreneurial Development Agency (Botswana)</w:t>
       </w:r>
     </w:p>
     <w:p>
@@ -1878,12 +1898,12 @@
           <w:b/>
           <w:bCs/>
         </w:rPr>
-        <w:t>COMESA</w:t>
+        <w:t>CEEC</w:t>
       </w:r>
       <w:r>
         <w:rPr/>
         <w:tab/>
-        <w:t>Common Market for Eastern and Southern Africa</w:t>
+        <w:t>Citizens Economic Empowerment Commission (Zambia)</w:t>
       </w:r>
     </w:p>
     <w:p>
@@ -1902,12 +1922,12 @@
           <w:b/>
           <w:bCs/>
         </w:rPr>
-        <w:t>DB</w:t>
+        <w:t>CGS</w:t>
       </w:r>
       <w:r>
         <w:rPr/>
         <w:tab/>
-        <w:t>Doing Business (World Bank report series, 2004-2020)</w:t>
+        <w:t>Credit Guarantee Scheme (Namibia)</w:t>
       </w:r>
     </w:p>
     <w:p>
@@ -1926,12 +1946,12 @@
           <w:b/>
           <w:bCs/>
         </w:rPr>
-        <w:t>DBN</w:t>
+        <w:t>CIPA</w:t>
       </w:r>
       <w:r>
         <w:rPr/>
         <w:tab/>
-        <w:t>Development Bank of Namibia</w:t>
+        <w:t>Companies and Intellectual Property Authority (Botswana)</w:t>
       </w:r>
     </w:p>
     <w:p>
@@ -1950,12 +1970,12 @@
           <w:b/>
           <w:bCs/>
         </w:rPr>
-        <w:t>DFI</w:t>
+        <w:t>COMESA</w:t>
       </w:r>
       <w:r>
         <w:rPr/>
         <w:tab/>
-        <w:t>Development finance institution</w:t>
+        <w:t>Common Market for Eastern and Southern Africa</w:t>
       </w:r>
     </w:p>
     <w:p>
@@ -1974,12 +1994,12 @@
           <w:b/>
           <w:bCs/>
         </w:rPr>
-        <w:t>DMC</w:t>
+        <w:t>DB</w:t>
       </w:r>
       <w:r>
         <w:rPr/>
         <w:tab/>
-        <w:t>Destination management company</w:t>
+        <w:t>Doing Business (World Bank report series, 2004-2020)</w:t>
       </w:r>
     </w:p>
     <w:p>
@@ -1998,12 +2018,12 @@
           <w:b/>
           <w:bCs/>
         </w:rPr>
-        <w:t>ECGC</w:t>
+        <w:t>DBN</w:t>
       </w:r>
       <w:r>
         <w:rPr/>
         <w:tab/>
-        <w:t>Export Credit Guarantee Company (Zimbabwe)</w:t>
+        <w:t>Development Bank of Namibia</w:t>
       </w:r>
     </w:p>
     <w:p>
@@ -2022,12 +2042,12 @@
           <w:b/>
           <w:bCs/>
         </w:rPr>
-        <w:t>EIF</w:t>
+        <w:t>DFI</w:t>
       </w:r>
       <w:r>
         <w:rPr/>
         <w:tab/>
-        <w:t>Environmental Investment Fund (Namibia)</w:t>
+        <w:t>Development finance institution</w:t>
       </w:r>
     </w:p>
     <w:p>
@@ -2046,12 +2066,12 @@
           <w:b/>
           <w:bCs/>
         </w:rPr>
-        <w:t>FENATA</w:t>
+        <w:t>DMC</w:t>
       </w:r>
       <w:r>
         <w:rPr/>
         <w:tab/>
-        <w:t>Federation of Namibian Tourism Associations</w:t>
+        <w:t>Destination management company</w:t>
       </w:r>
     </w:p>
     <w:p>
@@ -2070,12 +2090,12 @@
           <w:b/>
           <w:bCs/>
         </w:rPr>
-        <w:t>FGC</w:t>
+        <w:t>ECGC</w:t>
       </w:r>
       <w:r>
         <w:rPr/>
         <w:tab/>
-        <w:t>Fundo de Garantia de Crédito (Angola)</w:t>
+        <w:t>Export Credit Guarantee Company (Zimbabwe)</w:t>
       </w:r>
     </w:p>
     <w:p>
@@ -2094,12 +2114,12 @@
           <w:b/>
           <w:bCs/>
         </w:rPr>
-        <w:t>GIZ</w:t>
+        <w:t>EIF</w:t>
       </w:r>
       <w:r>
         <w:rPr/>
         <w:tab/>
-        <w:t>Deutsche Gesellschaft für Internationale Zusammenarbeit</w:t>
+        <w:t>Environmental Investment Fund (Namibia)</w:t>
       </w:r>
     </w:p>
     <w:p>
@@ -2118,12 +2138,12 @@
           <w:b/>
           <w:bCs/>
         </w:rPr>
-        <w:t>HAN</w:t>
+        <w:t>FENATA</w:t>
       </w:r>
       <w:r>
         <w:rPr/>
         <w:tab/>
-        <w:t>Hospitality Association of Namibia</w:t>
+        <w:t>Federation of Namibian Tourism Associations</w:t>
       </w:r>
     </w:p>
     <w:p>
@@ -2142,12 +2162,12 @@
           <w:b/>
           <w:bCs/>
         </w:rPr>
-        <w:t>HATAB</w:t>
+        <w:t>FGC</w:t>
       </w:r>
       <w:r>
         <w:rPr/>
         <w:tab/>
-        <w:t>Hospitality and Tourism Association of Botswana</w:t>
+        <w:t>Fundo de Garantia de Crédito (Angola)</w:t>
       </w:r>
     </w:p>
     <w:p>
@@ -2166,12 +2186,12 @@
           <w:b/>
           <w:bCs/>
         </w:rPr>
-        <w:t>ICT</w:t>
+        <w:t>GIZ</w:t>
       </w:r>
       <w:r>
         <w:rPr/>
         <w:tab/>
-        <w:t>Information and communications technology</w:t>
+        <w:t>Deutsche Gesellschaft für Internationale Zusammenarbeit</w:t>
       </w:r>
     </w:p>
     <w:p>
@@ -2190,12 +2210,12 @@
           <w:b/>
           <w:bCs/>
         </w:rPr>
-        <w:t>IDBZ</w:t>
+        <w:t>HAN</w:t>
       </w:r>
       <w:r>
         <w:rPr/>
         <w:tab/>
-        <w:t>Infrastructure Development Bank of Zimbabwe</w:t>
+        <w:t>Hospitality Association of Namibia</w:t>
       </w:r>
     </w:p>
     <w:p>
@@ -2214,12 +2234,12 @@
           <w:b/>
           <w:bCs/>
         </w:rPr>
-        <w:t>INAPEM</w:t>
+        <w:t>HATAB</w:t>
       </w:r>
       <w:r>
         <w:rPr/>
         <w:tab/>
-        <w:t>Instituto Nacional de Apoio às Micro, Pequenas e Médias Empresas (Angola)</w:t>
+        <w:t>Hospitality and Tourism Association of Botswana</w:t>
       </w:r>
     </w:p>
     <w:p>
@@ -2238,12 +2258,12 @@
           <w:b/>
           <w:bCs/>
         </w:rPr>
-        <w:t>ISO</w:t>
+        <w:t>ICT</w:t>
       </w:r>
       <w:r>
         <w:rPr/>
         <w:tab/>
-        <w:t>International Organization for Standardization</w:t>
+        <w:t>Information and communications technology</w:t>
       </w:r>
     </w:p>
     <w:p>
@@ -2262,12 +2282,12 @@
           <w:b/>
           <w:bCs/>
         </w:rPr>
-        <w:t>JV</w:t>
+        <w:t>IDBZ</w:t>
       </w:r>
       <w:r>
         <w:rPr/>
         <w:tab/>
-        <w:t>Joint venture</w:t>
+        <w:t>Infrastructure Development Bank of Zimbabwe</w:t>
       </w:r>
     </w:p>
     <w:p>
@@ -2286,12 +2306,12 @@
           <w:b/>
           <w:bCs/>
         </w:rPr>
-        <w:t>KAZA TFCA</w:t>
+        <w:t>INAPEM</w:t>
       </w:r>
       <w:r>
         <w:rPr/>
         <w:tab/>
-        <w:t>Kavango Zambezi Transfrontier Conservation Area</w:t>
+        <w:t>Instituto Nacional de Apoio às Micro, Pequenas e Médias Empresas (Angola)</w:t>
       </w:r>
     </w:p>
     <w:p>
@@ -2310,12 +2330,12 @@
           <w:b/>
           <w:bCs/>
         </w:rPr>
-        <w:t>LEA</w:t>
+        <w:t>IRDNC</w:t>
       </w:r>
       <w:r>
         <w:rPr/>
         <w:tab/>
-        <w:t>Local Enterprise Authority (Botswana)</w:t>
+        <w:t>Integrated Rural Development and Nature Conservation (Namibia)</w:t>
       </w:r>
     </w:p>
     <w:p>
@@ -2334,12 +2354,12 @@
           <w:b/>
           <w:bCs/>
         </w:rPr>
-        <w:t>MD</w:t>
+        <w:t>ISO</w:t>
       </w:r>
       <w:r>
         <w:rPr/>
         <w:tab/>
-        <w:t>KAZA R-NBT Macro Diagnostic Report</w:t>
+        <w:t>International Organization for Standardization</w:t>
       </w:r>
     </w:p>
     <w:p>
@@ -2358,12 +2378,12 @@
           <w:b/>
           <w:bCs/>
         </w:rPr>
-        <w:t>MFI</w:t>
+        <w:t>JV</w:t>
       </w:r>
       <w:r>
         <w:rPr/>
         <w:tab/>
-        <w:t>Microfinance institution</w:t>
+        <w:t>Joint venture</w:t>
       </w:r>
     </w:p>
     <w:p>
@@ -2382,12 +2402,12 @@
           <w:b/>
           <w:bCs/>
         </w:rPr>
-        <w:t>MSME</w:t>
+        <w:t>KAZA TFCA</w:t>
       </w:r>
       <w:r>
         <w:rPr/>
         <w:tab/>
-        <w:t>Micro, small and medium-sized enterprise</w:t>
+        <w:t>Kavango Zambezi Transfrontier Conservation Area</w:t>
       </w:r>
     </w:p>
     <w:p>
@@ -2406,12 +2426,12 @@
           <w:b/>
           <w:bCs/>
         </w:rPr>
-        <w:t>NACSO</w:t>
+        <w:t>LEA</w:t>
       </w:r>
       <w:r>
         <w:rPr/>
         <w:tab/>
-        <w:t>Namibian Association of CBNRM Support Organisations</w:t>
+        <w:t>Local Enterprise Authority (Botswana)</w:t>
       </w:r>
     </w:p>
     <w:p>
@@ -2430,12 +2450,12 @@
           <w:b/>
           <w:bCs/>
         </w:rPr>
-        <w:t>NDB</w:t>
+        <w:t>MD</w:t>
       </w:r>
       <w:r>
         <w:rPr/>
         <w:tab/>
-        <w:t>National Development Bank (Botswana)</w:t>
+        <w:t>KAZA R-NBT Macro Diagnostic Report</w:t>
       </w:r>
     </w:p>
     <w:p>
@@ -2454,12 +2474,12 @@
           <w:b/>
           <w:bCs/>
         </w:rPr>
-        <w:t>NEET</w:t>
+        <w:t>MFI</w:t>
       </w:r>
       <w:r>
         <w:rPr/>
         <w:tab/>
-        <w:t>Not in employment, education or training</w:t>
+        <w:t>Microfinance institution</w:t>
       </w:r>
     </w:p>
     <w:p>
@@ -2478,12 +2498,12 @@
           <w:b/>
           <w:bCs/>
         </w:rPr>
-        <w:t>NIPDB</w:t>
+        <w:t>MINTUR</w:t>
       </w:r>
       <w:r>
         <w:rPr/>
         <w:tab/>
-        <w:t>Namibia Investment Promotion and Development Board</w:t>
+        <w:t>Ministério do Turismo (Angola)</w:t>
       </w:r>
     </w:p>
     <w:p>
@@ -2502,12 +2522,12 @@
           <w:b/>
           <w:bCs/>
         </w:rPr>
-        <w:t>NTB</w:t>
+        <w:t>MSME</w:t>
       </w:r>
       <w:r>
         <w:rPr/>
         <w:tab/>
-        <w:t>Namibia Tourism Board</w:t>
+        <w:t>Micro, small and medium-sized enterprise</w:t>
       </w:r>
     </w:p>
     <w:p>
@@ -2526,12 +2546,12 @@
           <w:b/>
           <w:bCs/>
         </w:rPr>
-        <w:t>OSISC</w:t>
+        <w:t>NACSO</w:t>
       </w:r>
       <w:r>
         <w:rPr/>
         <w:tab/>
-        <w:t>One Stop Investment Services Centre (ZIDA, Zimbabwe)</w:t>
+        <w:t>Namibian Association of CBNRM Support Organisations</w:t>
       </w:r>
     </w:p>
     <w:p>
@@ -2550,12 +2570,12 @@
           <w:b/>
           <w:bCs/>
         </w:rPr>
-        <w:t>PSDP</w:t>
+        <w:t>NCCI</w:t>
       </w:r>
       <w:r>
         <w:rPr/>
         <w:tab/>
-        <w:t>Private Sector Development Programme (Botswana)</w:t>
+        <w:t>Namibia Chamber of Commerce and Industry</w:t>
       </w:r>
     </w:p>
     <w:p>
@@ -2574,12 +2594,12 @@
           <w:b/>
           <w:bCs/>
         </w:rPr>
-        <w:t>R-NBT</w:t>
+        <w:t>NDB</w:t>
       </w:r>
       <w:r>
         <w:rPr/>
         <w:tab/>
-        <w:t>Regenerative nature-based tourism</w:t>
+        <w:t>National Development Bank (Botswana)</w:t>
       </w:r>
     </w:p>
     <w:p>
@@ -2598,12 +2618,12 @@
           <w:b/>
           <w:bCs/>
         </w:rPr>
-        <w:t>SADC</w:t>
+        <w:t>NEET</w:t>
       </w:r>
       <w:r>
         <w:rPr/>
         <w:tab/>
-        <w:t>Southern African Development Community</w:t>
+        <w:t>Not in employment, education or training</w:t>
       </w:r>
     </w:p>
     <w:p>
@@ -2622,12 +2642,12 @@
           <w:b/>
           <w:bCs/>
         </w:rPr>
-        <w:t>SMEDCO</w:t>
+        <w:t>NIPDB</w:t>
       </w:r>
       <w:r>
         <w:rPr/>
         <w:tab/>
-        <w:t>Small and Medium Enterprises Development Corporation (Zimbabwe)</w:t>
+        <w:t>Namibia Investment Promotion and Development Board</w:t>
       </w:r>
     </w:p>
     <w:p>
@@ -2646,12 +2666,12 @@
           <w:b/>
           <w:bCs/>
         </w:rPr>
-        <w:t>SMME</w:t>
+        <w:t>NNF</w:t>
       </w:r>
       <w:r>
         <w:rPr/>
         <w:tab/>
-        <w:t>Small, medium and micro enterprise (term used in Botswana; equivalent to MSME)</w:t>
+        <w:t>Namibia Nature Foundation</w:t>
       </w:r>
     </w:p>
     <w:p>
@@ -2670,12 +2690,12 @@
           <w:b/>
           <w:bCs/>
         </w:rPr>
-        <w:t>STR</w:t>
+        <w:t>NTB</w:t>
       </w:r>
       <w:r>
         <w:rPr/>
         <w:tab/>
-        <w:t>Simplified Trade Regime</w:t>
+        <w:t>Namibia Tourism Board</w:t>
       </w:r>
     </w:p>
     <w:p>
@@ -2694,12 +2714,12 @@
           <w:b/>
           <w:bCs/>
         </w:rPr>
-        <w:t>TA</w:t>
+        <w:t>NUST</w:t>
       </w:r>
       <w:r>
         <w:rPr/>
         <w:tab/>
-        <w:t>Technical assistance</w:t>
+        <w:t>Namibia University of Science and Technology</w:t>
       </w:r>
     </w:p>
     <w:p>
@@ -2718,12 +2738,12 @@
           <w:b/>
           <w:bCs/>
         </w:rPr>
-        <w:t>TBCZ</w:t>
+        <w:t>OSISC</w:t>
       </w:r>
       <w:r>
         <w:rPr/>
         <w:tab/>
-        <w:t>Tourism Business Council of Zimbabwe</w:t>
+        <w:t>One Stop Investment Services Centre (ZIDA, Zimbabwe)</w:t>
       </w:r>
     </w:p>
     <w:p>
@@ -2742,12 +2762,12 @@
           <w:b/>
           <w:bCs/>
         </w:rPr>
-        <w:t>TCZ</w:t>
+        <w:t>PSDP</w:t>
       </w:r>
       <w:r>
         <w:rPr/>
         <w:tab/>
-        <w:t>Tourism Council of Zambia</w:t>
+        <w:t>Private Sector Development Programme (Botswana)</w:t>
       </w:r>
     </w:p>
     <w:p>
@@ -2766,12 +2786,12 @@
           <w:b/>
           <w:bCs/>
         </w:rPr>
-        <w:t>VSLA</w:t>
+        <w:t>R-NBT</w:t>
       </w:r>
       <w:r>
         <w:rPr/>
         <w:tab/>
-        <w:t>Village savings and loan association</w:t>
+        <w:t>Regenerative nature-based tourism</w:t>
       </w:r>
     </w:p>
     <w:p>
@@ -2790,12 +2810,12 @@
           <w:b/>
           <w:bCs/>
         </w:rPr>
-        <w:t>WIBA</w:t>
+        <w:t>RDC</w:t>
       </w:r>
       <w:r>
         <w:rPr/>
         <w:tab/>
-        <w:t>Women in Business Association (Botswana)</w:t>
+        <w:t>Rural District Council (Zimbabwe)</w:t>
       </w:r>
     </w:p>
     <w:p>
@@ -2814,12 +2834,12 @@
           <w:b/>
           <w:bCs/>
         </w:rPr>
-        <w:t>YDF</w:t>
+        <w:t>SADC</w:t>
       </w:r>
       <w:r>
         <w:rPr/>
         <w:tab/>
-        <w:t>Youth Development Fund (Botswana)</w:t>
+        <w:t>Southern African Development Community</w:t>
       </w:r>
     </w:p>
     <w:p>
@@ -2838,12 +2858,12 @@
           <w:b/>
           <w:bCs/>
         </w:rPr>
-        <w:t>ZCGS</w:t>
+        <w:t>SMEDCO</w:t>
       </w:r>
       <w:r>
         <w:rPr/>
         <w:tab/>
-        <w:t>Zambia Credit Guarantee Scheme</w:t>
+        <w:t>Small and Medium Enterprises Development Corporation (Zimbabwe)</w:t>
       </w:r>
     </w:p>
     <w:p>
@@ -2862,12 +2882,12 @@
           <w:b/>
           <w:bCs/>
         </w:rPr>
-        <w:t>ZCSMBA</w:t>
+        <w:t>SMME</w:t>
       </w:r>
       <w:r>
         <w:rPr/>
         <w:tab/>
-        <w:t>Zambia Chamber of Small and Medium Business Associations</w:t>
+        <w:t>Small, medium and micro enterprise (term used in Botswana; equivalent to MSME)</w:t>
       </w:r>
     </w:p>
     <w:p>
@@ -2886,12 +2906,12 @@
           <w:b/>
           <w:bCs/>
         </w:rPr>
-        <w:t>ZDA</w:t>
+        <w:t>STR</w:t>
       </w:r>
       <w:r>
         <w:rPr/>
         <w:tab/>
-        <w:t>Zambia Development Agency</w:t>
+        <w:t>Simplified Trade Regime</w:t>
       </w:r>
     </w:p>
     <w:p>
@@ -2910,12 +2930,12 @@
           <w:b/>
           <w:bCs/>
         </w:rPr>
-        <w:t>ZEEX</w:t>
+        <w:t>TA</w:t>
       </w:r>
       <w:r>
         <w:rPr/>
         <w:tab/>
-        <w:t>Zimbabwe Entrepreneurship Exchange</w:t>
+        <w:t>Technical assistance</w:t>
       </w:r>
     </w:p>
     <w:p>
@@ -2934,12 +2954,12 @@
           <w:b/>
           <w:bCs/>
         </w:rPr>
-        <w:t>ZIDA</w:t>
+        <w:t>TASA</w:t>
       </w:r>
       <w:r>
         <w:rPr/>
         <w:tab/>
-        <w:t>Zimbabwe Investment and Development Agency</w:t>
+        <w:t>Tour and Safari Association (Namibia)</w:t>
       </w:r>
     </w:p>
     <w:p>
@@ -2958,12 +2978,12 @@
           <w:b/>
           <w:bCs/>
         </w:rPr>
-        <w:t>ZIMRA</w:t>
+        <w:t>TBCZ</w:t>
       </w:r>
       <w:r>
         <w:rPr/>
         <w:tab/>
-        <w:t>Zimbabwe Revenue Authority</w:t>
+        <w:t>Tourism Business Council of Zimbabwe</w:t>
       </w:r>
     </w:p>
     <w:p>
@@ -2982,12 +3002,12 @@
           <w:b/>
           <w:bCs/>
         </w:rPr>
-        <w:t>ZMW</w:t>
+        <w:t>TCZ</w:t>
       </w:r>
       <w:r>
         <w:rPr/>
         <w:tab/>
-        <w:t>Zambian kwacha</w:t>
+        <w:t>Tourism Council of Zambia</w:t>
       </w:r>
     </w:p>
     <w:p>
@@ -3006,6 +3026,270 @@
           <w:b/>
           <w:bCs/>
         </w:rPr>
+        <w:t>UNAM</w:t>
+      </w:r>
+      <w:r>
+        <w:rPr/>
+        <w:tab/>
+        <w:t>University of Namibia</w:t>
+      </w:r>
+    </w:p>
+    <w:p>
+      <w:pPr>
+        <w:pStyle w:val="Normal"/>
+        <w:tabs>
+          <w:tab w:val="clear" w:pos="720"/>
+          <w:tab w:val="left" w:pos="1700" w:leader="none"/>
+        </w:tabs>
+        <w:spacing w:before="0" w:after="60"/>
+        <w:ind w:hanging="1700" w:left="1700"/>
+        <w:rPr/>
+      </w:pPr>
+      <w:r>
+        <w:rPr>
+          <w:b/>
+          <w:bCs/>
+        </w:rPr>
+        <w:t>VSLA</w:t>
+      </w:r>
+      <w:r>
+        <w:rPr/>
+        <w:tab/>
+        <w:t>Village savings and loan association</w:t>
+      </w:r>
+    </w:p>
+    <w:p>
+      <w:pPr>
+        <w:pStyle w:val="Normal"/>
+        <w:tabs>
+          <w:tab w:val="clear" w:pos="720"/>
+          <w:tab w:val="left" w:pos="1700" w:leader="none"/>
+        </w:tabs>
+        <w:spacing w:before="0" w:after="60"/>
+        <w:ind w:hanging="1700" w:left="1700"/>
+        <w:rPr/>
+      </w:pPr>
+      <w:r>
+        <w:rPr>
+          <w:b/>
+          <w:bCs/>
+        </w:rPr>
+        <w:t>WIBA</w:t>
+      </w:r>
+      <w:r>
+        <w:rPr/>
+        <w:tab/>
+        <w:t>Women in Business Association (Botswana)</w:t>
+      </w:r>
+    </w:p>
+    <w:p>
+      <w:pPr>
+        <w:pStyle w:val="Normal"/>
+        <w:tabs>
+          <w:tab w:val="clear" w:pos="720"/>
+          <w:tab w:val="left" w:pos="1700" w:leader="none"/>
+        </w:tabs>
+        <w:spacing w:before="0" w:after="60"/>
+        <w:ind w:hanging="1700" w:left="1700"/>
+        <w:rPr/>
+      </w:pPr>
+      <w:r>
+        <w:rPr>
+          <w:b/>
+          <w:bCs/>
+        </w:rPr>
+        <w:t>YDF</w:t>
+      </w:r>
+      <w:r>
+        <w:rPr/>
+        <w:tab/>
+        <w:t>Youth Development Fund (Botswana)</w:t>
+      </w:r>
+    </w:p>
+    <w:p>
+      <w:pPr>
+        <w:pStyle w:val="Normal"/>
+        <w:tabs>
+          <w:tab w:val="clear" w:pos="720"/>
+          <w:tab w:val="left" w:pos="1700" w:leader="none"/>
+        </w:tabs>
+        <w:spacing w:before="0" w:after="60"/>
+        <w:ind w:hanging="1700" w:left="1700"/>
+        <w:rPr/>
+      </w:pPr>
+      <w:r>
+        <w:rPr>
+          <w:b/>
+          <w:bCs/>
+        </w:rPr>
+        <w:t>ZCGS</w:t>
+      </w:r>
+      <w:r>
+        <w:rPr/>
+        <w:tab/>
+        <w:t>Zambia Credit Guarantee Scheme</w:t>
+      </w:r>
+    </w:p>
+    <w:p>
+      <w:pPr>
+        <w:pStyle w:val="Normal"/>
+        <w:tabs>
+          <w:tab w:val="clear" w:pos="720"/>
+          <w:tab w:val="left" w:pos="1700" w:leader="none"/>
+        </w:tabs>
+        <w:spacing w:before="0" w:after="60"/>
+        <w:ind w:hanging="1700" w:left="1700"/>
+        <w:rPr/>
+      </w:pPr>
+      <w:r>
+        <w:rPr>
+          <w:b/>
+          <w:bCs/>
+        </w:rPr>
+        <w:t>ZCSMBA</w:t>
+      </w:r>
+      <w:r>
+        <w:rPr/>
+        <w:tab/>
+        <w:t>Zambia Chamber of Small and Medium Business Associations</w:t>
+      </w:r>
+    </w:p>
+    <w:p>
+      <w:pPr>
+        <w:pStyle w:val="Normal"/>
+        <w:tabs>
+          <w:tab w:val="clear" w:pos="720"/>
+          <w:tab w:val="left" w:pos="1700" w:leader="none"/>
+        </w:tabs>
+        <w:spacing w:before="0" w:after="60"/>
+        <w:ind w:hanging="1700" w:left="1700"/>
+        <w:rPr/>
+      </w:pPr>
+      <w:r>
+        <w:rPr>
+          <w:b/>
+          <w:bCs/>
+        </w:rPr>
+        <w:t>ZDA</w:t>
+      </w:r>
+      <w:r>
+        <w:rPr/>
+        <w:tab/>
+        <w:t>Zambia Development Agency</w:t>
+      </w:r>
+    </w:p>
+    <w:p>
+      <w:pPr>
+        <w:pStyle w:val="Normal"/>
+        <w:tabs>
+          <w:tab w:val="clear" w:pos="720"/>
+          <w:tab w:val="left" w:pos="1700" w:leader="none"/>
+        </w:tabs>
+        <w:spacing w:before="0" w:after="60"/>
+        <w:ind w:hanging="1700" w:left="1700"/>
+        <w:rPr/>
+      </w:pPr>
+      <w:r>
+        <w:rPr>
+          <w:b/>
+          <w:bCs/>
+        </w:rPr>
+        <w:t>ZEEX</w:t>
+      </w:r>
+      <w:r>
+        <w:rPr/>
+        <w:tab/>
+        <w:t>Zimbabwe Entrepreneurship Exchange</w:t>
+      </w:r>
+    </w:p>
+    <w:p>
+      <w:pPr>
+        <w:pStyle w:val="Normal"/>
+        <w:tabs>
+          <w:tab w:val="clear" w:pos="720"/>
+          <w:tab w:val="left" w:pos="1700" w:leader="none"/>
+        </w:tabs>
+        <w:spacing w:before="0" w:after="60"/>
+        <w:ind w:hanging="1700" w:left="1700"/>
+        <w:rPr/>
+      </w:pPr>
+      <w:r>
+        <w:rPr>
+          <w:b/>
+          <w:bCs/>
+        </w:rPr>
+        <w:t>ZIDA</w:t>
+      </w:r>
+      <w:r>
+        <w:rPr/>
+        <w:tab/>
+        <w:t>Zimbabwe Investment and Development Agency</w:t>
+      </w:r>
+    </w:p>
+    <w:p>
+      <w:pPr>
+        <w:pStyle w:val="Normal"/>
+        <w:tabs>
+          <w:tab w:val="clear" w:pos="720"/>
+          <w:tab w:val="left" w:pos="1700" w:leader="none"/>
+        </w:tabs>
+        <w:spacing w:before="0" w:after="60"/>
+        <w:ind w:hanging="1700" w:left="1700"/>
+        <w:rPr/>
+      </w:pPr>
+      <w:r>
+        <w:rPr>
+          <w:b/>
+          <w:bCs/>
+        </w:rPr>
+        <w:t>ZIMRA</w:t>
+      </w:r>
+      <w:r>
+        <w:rPr/>
+        <w:tab/>
+        <w:t>Zimbabwe Revenue Authority</w:t>
+      </w:r>
+    </w:p>
+    <w:p>
+      <w:pPr>
+        <w:pStyle w:val="Normal"/>
+        <w:tabs>
+          <w:tab w:val="clear" w:pos="720"/>
+          <w:tab w:val="left" w:pos="1700" w:leader="none"/>
+        </w:tabs>
+        <w:spacing w:before="0" w:after="60"/>
+        <w:ind w:hanging="1700" w:left="1700"/>
+        <w:rPr/>
+      </w:pPr>
+      <w:r>
+        <w:rPr>
+          <w:b/>
+          <w:bCs/>
+        </w:rPr>
+        <w:t>ZMW</w:t>
+      </w:r>
+      <w:r>
+        <w:rPr/>
+        <w:tab/>
+        <w:t>Zambian kwacha</w:t>
+      </w:r>
+    </w:p>
+    <w:p>
+      <w:pPr>
+        <w:pStyle w:val="Normal"/>
+        <w:tabs>
+          <w:tab w:val="clear" w:pos="720"/>
+          <w:tab w:val="left" w:pos="1700" w:leader="none"/>
+        </w:tabs>
+        <w:spacing w:before="0" w:after="60"/>
+        <w:ind w:hanging="1700" w:left="1700"/>
+        <w:rPr/>
+      </w:pPr>
+      <w:r>
+        <w:rPr>
+          <w:b/>
+          <w:bCs/>
+        </w:rPr>
         <w:t>ZTA</w:t>
       </w:r>
       <w:r>
@@ -3023,7 +3307,7 @@
         <w:spacing w:before="0" w:after="240"/>
         <w:rPr/>
       </w:pPr>
-      <w:bookmarkStart w:id="0" w:name="__RefHeading___Toc1113_4016896087"/>
+      <w:bookmarkStart w:id="0" w:name="__RefHeading___Toc1251_3920751122"/>
       <w:bookmarkEnd w:id="0"/>
       <w:r>
         <w:rPr/>
@@ -3198,7 +3482,7 @@
       </w:r>
       <w:r>
         <w:rPr/>
-        <w:t xml:space="preserve"> MSMEs need supplier-readiness skills (quality, volume, reliability and pricing), aggregation into producer groups and cooperatives, basic bookkeeping and seasonal cash-flow planning, and formalisation sequenced to buyer and lender demands. BSOs offer mostly generic training, are concentrated in capitals, lack a common readiness diagnostic and seldom broker finance. A needs and capacity survey carried out in Botswana for the EU-funded Private Sector Development Programme found many of the same gaps more than a decade ago, which shows how persistent they are. It adds quality assurance and standards, productivity, market intelligence, negotiation and collective advocacy to the MSME list, and organisational systems, coordination between BSOs and impact monitoring to the BSO list. Chapter 6 also sets out ten roles that BSOs play along the readiness pathway, from diagnosis and training to finance brokerage and advocacy. Financial institutions need to learn seasonal cash-flow lending, use contracts, receivables and movable assets as security, use existing guarantee schemes, and collect sex-disaggregated portfolio data.</w:t>
+        <w:t xml:space="preserve"> MSMEs need supplier-readiness skills (quality, volume, reliability and pricing), aggregation into producer groups and cooperatives, basic bookkeeping and seasonal cash-flow planning, and formalisation sequenced to buyer and lender demands. BSOs offer mostly generic training, are concentrated in capitals, lack a common readiness diagnostic and seldom broker finance. A needs and capacity survey carried out in Botswana for the EU-funded Private Sector Development Programme found many of the same gaps more than a decade ago, which shows how persistent they are. It adds quality assurance and standards, productivity, market intelligence, negotiation and collective advocacy to the MSME list, and organisational systems, coordination between BSOs and impact monitoring to the BSO list. Chapter 6 also sets out ten roles that BSOs play along the readiness pathway, from diagnosis and training to finance brokerage and advocacy. It then applies these needs to tourism MSMEs in each Partner State. Angola needs readiness first (formalisation, basic business skills and Angolan guiding and logistics capacity in Cuando and Cubango). Botswana needs supplier development, standards and contract finance around the Kasane and Maun anchors. Namibia needs lodge-linked goods made to specification and a pathway from conservancy benefit to enterprise. Zambia needs smallholder aggregation, certification and youth enterprise in Livingstone. Zimbabwe needs tax clearance, irrigated produce supply and record-keeping around Victoria Falls and Hwange. Each country's needs are matched to interventions and to a lead BSO (INAPEM, LEA, NIPDB, ZDA and CEEC, and SMEDCO) and its partners. Financial institutions need to learn seasonal cash-flow lending, use contracts, receivables and movable assets as security, use existing guarantee schemes, and collect sex-disaggregated portfolio data.</w:t>
       </w:r>
     </w:p>
     <w:p>
@@ -3339,7 +3623,7 @@
         <w:spacing w:before="0" w:after="240"/>
         <w:rPr/>
       </w:pPr>
-      <w:bookmarkStart w:id="1" w:name="__RefHeading___Toc1115_4016896087"/>
+      <w:bookmarkStart w:id="1" w:name="__RefHeading___Toc1253_3920751122"/>
       <w:bookmarkEnd w:id="1"/>
       <w:r>
         <w:rPr/>
@@ -3351,7 +3635,7 @@
         <w:pStyle w:val="Heading2"/>
         <w:rPr/>
       </w:pPr>
-      <w:bookmarkStart w:id="2" w:name="__RefHeading___Toc1117_4016896087"/>
+      <w:bookmarkStart w:id="2" w:name="__RefHeading___Toc1255_3920751122"/>
       <w:bookmarkEnd w:id="2"/>
       <w:r>
         <w:rPr/>
@@ -3479,7 +3763,7 @@
         <w:pStyle w:val="Heading2"/>
         <w:rPr/>
       </w:pPr>
-      <w:bookmarkStart w:id="3" w:name="__RefHeading___Toc1119_4016896087"/>
+      <w:bookmarkStart w:id="3" w:name="__RefHeading___Toc1257_3920751122"/>
       <w:bookmarkEnd w:id="3"/>
       <w:r>
         <w:rPr/>
@@ -3603,7 +3887,7 @@
         <w:pStyle w:val="Heading2"/>
         <w:rPr/>
       </w:pPr>
-      <w:bookmarkStart w:id="4" w:name="__RefHeading___Toc1121_4016896087"/>
+      <w:bookmarkStart w:id="4" w:name="__RefHeading___Toc1259_3920751122"/>
       <w:bookmarkEnd w:id="4"/>
       <w:r>
         <w:rPr/>
@@ -3793,7 +4077,7 @@
         <w:pStyle w:val="Heading2"/>
         <w:rPr/>
       </w:pPr>
-      <w:bookmarkStart w:id="5" w:name="__RefHeading___Toc1123_4016896087"/>
+      <w:bookmarkStart w:id="5" w:name="__RefHeading___Toc1261_3920751122"/>
       <w:bookmarkEnd w:id="5"/>
       <w:r>
         <w:rPr/>
@@ -3914,7 +4198,7 @@
         <w:spacing w:before="0" w:after="240"/>
         <w:rPr/>
       </w:pPr>
-      <w:bookmarkStart w:id="6" w:name="__RefHeading___Toc1125_4016896087"/>
+      <w:bookmarkStart w:id="6" w:name="__RefHeading___Toc1263_3920751122"/>
       <w:bookmarkEnd w:id="6"/>
       <w:r>
         <w:rPr/>
@@ -3926,7 +4210,7 @@
         <w:pStyle w:val="Heading2"/>
         <w:rPr/>
       </w:pPr>
-      <w:bookmarkStart w:id="7" w:name="__RefHeading___Toc1127_4016896087"/>
+      <w:bookmarkStart w:id="7" w:name="__RefHeading___Toc1265_3920751122"/>
       <w:bookmarkEnd w:id="7"/>
       <w:r>
         <w:rPr/>
@@ -4188,7 +4472,7 @@
         <w:pStyle w:val="Heading2"/>
         <w:rPr/>
       </w:pPr>
-      <w:bookmarkStart w:id="8" w:name="__RefHeading___Toc1129_4016896087"/>
+      <w:bookmarkStart w:id="8" w:name="__RefHeading___Toc1267_3920751122"/>
       <w:bookmarkEnd w:id="8"/>
       <w:r>
         <w:rPr/>
@@ -4295,7 +4579,7 @@
         <w:spacing w:before="0" w:after="240"/>
         <w:rPr/>
       </w:pPr>
-      <w:bookmarkStart w:id="9" w:name="__RefHeading___Toc1131_4016896087"/>
+      <w:bookmarkStart w:id="9" w:name="__RefHeading___Toc1269_3920751122"/>
       <w:bookmarkEnd w:id="9"/>
       <w:r>
         <w:rPr/>
@@ -4307,7 +4591,7 @@
         <w:pStyle w:val="Heading2"/>
         <w:rPr/>
       </w:pPr>
-      <w:bookmarkStart w:id="10" w:name="__RefHeading___Toc1133_4016896087"/>
+      <w:bookmarkStart w:id="10" w:name="__RefHeading___Toc1271_3920751122"/>
       <w:bookmarkEnd w:id="10"/>
       <w:r>
         <w:rPr/>
@@ -4435,7 +4719,7 @@
         <w:pStyle w:val="Heading2"/>
         <w:rPr/>
       </w:pPr>
-      <w:bookmarkStart w:id="11" w:name="__RefHeading___Toc1135_4016896087"/>
+      <w:bookmarkStart w:id="11" w:name="__RefHeading___Toc1273_3920751122"/>
       <w:bookmarkEnd w:id="11"/>
       <w:r>
         <w:rPr/>
@@ -4616,7 +4900,7 @@
         <w:spacing w:before="0" w:after="240"/>
         <w:rPr/>
       </w:pPr>
-      <w:bookmarkStart w:id="12" w:name="__RefHeading___Toc1137_4016896087"/>
+      <w:bookmarkStart w:id="12" w:name="__RefHeading___Toc1275_3920751122"/>
       <w:bookmarkEnd w:id="12"/>
       <w:r>
         <w:rPr/>
@@ -4628,7 +4912,7 @@
         <w:pStyle w:val="Heading2"/>
         <w:rPr/>
       </w:pPr>
-      <w:bookmarkStart w:id="13" w:name="__RefHeading___Toc1139_4016896087"/>
+      <w:bookmarkStart w:id="13" w:name="__RefHeading___Toc1277_3920751122"/>
       <w:bookmarkEnd w:id="13"/>
       <w:r>
         <w:rPr/>
@@ -4756,7 +5040,7 @@
         <w:pStyle w:val="Heading2"/>
         <w:rPr/>
       </w:pPr>
-      <w:bookmarkStart w:id="14" w:name="__RefHeading___Toc1141_4016896087"/>
+      <w:bookmarkStart w:id="14" w:name="__RefHeading___Toc1279_3920751122"/>
       <w:bookmarkEnd w:id="14"/>
       <w:r>
         <w:rPr/>
@@ -4835,7 +5119,7 @@
         <w:pStyle w:val="Heading2"/>
         <w:rPr/>
       </w:pPr>
-      <w:bookmarkStart w:id="15" w:name="__RefHeading___Toc1143_4016896087"/>
+      <w:bookmarkStart w:id="15" w:name="__RefHeading___Toc1281_3920751122"/>
       <w:bookmarkEnd w:id="15"/>
       <w:r>
         <w:rPr/>
@@ -4964,7 +5248,7 @@
         <w:pStyle w:val="Heading2"/>
         <w:rPr/>
       </w:pPr>
-      <w:bookmarkStart w:id="16" w:name="__RefHeading___Toc1145_4016896087"/>
+      <w:bookmarkStart w:id="16" w:name="__RefHeading___Toc1283_3920751122"/>
       <w:bookmarkEnd w:id="16"/>
       <w:r>
         <w:rPr/>
@@ -5115,7 +5399,7 @@
         <w:spacing w:before="0" w:after="240"/>
         <w:rPr/>
       </w:pPr>
-      <w:bookmarkStart w:id="17" w:name="__RefHeading___Toc1147_4016896087"/>
+      <w:bookmarkStart w:id="17" w:name="__RefHeading___Toc1285_3920751122"/>
       <w:bookmarkEnd w:id="17"/>
       <w:r>
         <w:rPr/>
@@ -5127,7 +5411,7 @@
         <w:pStyle w:val="Heading2"/>
         <w:rPr/>
       </w:pPr>
-      <w:bookmarkStart w:id="18" w:name="__RefHeading___Toc1149_4016896087"/>
+      <w:bookmarkStart w:id="18" w:name="__RefHeading___Toc1287_3920751122"/>
       <w:bookmarkEnd w:id="18"/>
       <w:r>
         <w:rPr/>
@@ -5150,7 +5434,7 @@
         <w:pStyle w:val="Heading2"/>
         <w:rPr/>
       </w:pPr>
-      <w:bookmarkStart w:id="19" w:name="__RefHeading___Toc1151_4016896087"/>
+      <w:bookmarkStart w:id="19" w:name="__RefHeading___Toc1289_3920751122"/>
       <w:bookmarkEnd w:id="19"/>
       <w:r>
         <w:rPr/>
@@ -5307,7 +5591,7 @@
         <w:pStyle w:val="Heading2"/>
         <w:rPr/>
       </w:pPr>
-      <w:bookmarkStart w:id="20" w:name="__RefHeading___Toc1153_4016896087"/>
+      <w:bookmarkStart w:id="20" w:name="__RefHeading___Toc1291_3920751122"/>
       <w:bookmarkEnd w:id="20"/>
       <w:r>
         <w:rPr/>
@@ -5424,7 +5708,7 @@
         <w:pStyle w:val="Heading2"/>
         <w:rPr/>
       </w:pPr>
-      <w:bookmarkStart w:id="21" w:name="__RefHeading___Toc1155_4016896087"/>
+      <w:bookmarkStart w:id="21" w:name="__RefHeading___Toc1293_3920751122"/>
       <w:bookmarkEnd w:id="21"/>
       <w:r>
         <w:rPr/>
@@ -5520,7 +5804,7 @@
         <w:spacing w:before="0" w:after="240"/>
         <w:rPr/>
       </w:pPr>
-      <w:bookmarkStart w:id="22" w:name="__RefHeading___Toc1157_4016896087"/>
+      <w:bookmarkStart w:id="22" w:name="__RefHeading___Toc1295_3920751122"/>
       <w:bookmarkEnd w:id="22"/>
       <w:r>
         <w:rPr/>
@@ -5535,7 +5819,7 @@
       </w:pPr>
       <w:r>
         <w:rPr/>
-        <w:t>This chapter identifies what MSMEs, BSOs and financial institutions need in order to improve investment readiness and make financing more inclusive. The needs follow from the business models, financial practices and readiness ratings in Chapters 3 to 5, and from the enabling-environment evidence in Chapter 7.</w:t>
+        <w:t>This chapter identifies what MSMEs, BSOs and financial institutions need in order to improve investment readiness and make financing more inclusive. The needs follow from the business models, financial practices and readiness ratings in Chapters 3 to 5, and from the enabling-environment evidence in Chapter 7. Sections 6.1 to 6.3 set out the needs that apply across KAZA; Section 6.4 applies them to tourism MSMEs in each Partner State, with the recommended interventions and the support BSOs in each country.</w:t>
       </w:r>
     </w:p>
     <w:p>
@@ -5554,7 +5838,7 @@
         <w:pStyle w:val="Heading2"/>
         <w:rPr/>
       </w:pPr>
-      <w:bookmarkStart w:id="23" w:name="__RefHeading___Toc1159_4016896087"/>
+      <w:bookmarkStart w:id="23" w:name="__RefHeading___Toc1297_3920751122"/>
       <w:bookmarkEnd w:id="23"/>
       <w:r>
         <w:rPr/>
@@ -6113,7 +6397,7 @@
         <w:pStyle w:val="Heading2"/>
         <w:rPr/>
       </w:pPr>
-      <w:bookmarkStart w:id="24" w:name="__RefHeading___Toc1161_4016896087"/>
+      <w:bookmarkStart w:id="24" w:name="__RefHeading___Toc1299_3920751122"/>
       <w:bookmarkEnd w:id="24"/>
       <w:r>
         <w:rPr/>
@@ -6676,7 +6960,7 @@
         <w:pStyle w:val="Heading2"/>
         <w:rPr/>
       </w:pPr>
-      <w:bookmarkStart w:id="25" w:name="__RefHeading___Toc1163_4016896087"/>
+      <w:bookmarkStart w:id="25" w:name="__RefHeading___Toc1301_3920751122"/>
       <w:bookmarkEnd w:id="25"/>
       <w:r>
         <w:rPr/>
@@ -6858,6 +7142,816 @@
         <w:rPr/>
         <w:t>Financial institutions' gaps are of medium to high priority and affect all chains, especially supply chains: seasonal structuring, alternative collateral, guarantee use and gender-disaggregated data. Anchor buyers' gaps are of medium priority but matter for food, lodge-linked goods and transport: a commitment to supplier development, payment terms that support MSME cash flow, and standard contract templates.</w:t>
       </w:r>
+    </w:p>
+    <w:p>
+      <w:pPr>
+        <w:pStyle w:val="Heading2"/>
+        <w:rPr/>
+      </w:pPr>
+      <w:bookmarkStart w:id="26" w:name="__RefHeading___Toc1303_3920751122"/>
+      <w:bookmarkEnd w:id="26"/>
+      <w:r>
+        <w:rPr/>
+        <w:t>6.4 Tourism MSME Needs, Interventions and Support BSOs by Country</w:t>
+      </w:r>
+    </w:p>
+    <w:p>
+      <w:pPr>
+        <w:pStyle w:val="Normal"/>
+        <w:jc w:val="both"/>
+        <w:rPr/>
+      </w:pPr>
+      <w:r>
+        <w:rPr/>
+        <w:t>The needs above apply across KAZA, but their weight, the interventions that fit and the BSOs able to deliver them differ by Partner State. This section applies them to tourism MSMEs in the KAZA area of each country: enterprises that sell to tourists directly (guiding, activities, transfers, accommodation, crafts) and those that supply lodges and operators (food, lodge-linked goods, services, nature-positive products). For each country it sets out the main needs, the recommended intervention and its delivery mode (using the PSDP survey's types: technical assistance, mentoring and coaching, on-the-job training, workshops and benchmarking visits), the support BSOs, with the proposed lead BSO first (Section 10.5), and a priority rating.</w:t>
+      </w:r>
+    </w:p>
+    <w:p>
+      <w:pPr>
+        <w:pStyle w:val="Normal"/>
+        <w:jc w:val="both"/>
+        <w:rPr/>
+      </w:pPr>
+      <w:r>
+        <w:rPr/>
+        <w:t>The ratings are the author's assessment from the evidence in Chapters 2 to 5 and 7 and the Financial Landscape Analysis. Evidence is uneven: Botswana, Zimbabwe and Zambia are better covered than Namibia (7 of 71 survey responses) and Angola (no survey responses) (MD p. 10, 109), so the Namibian and Angolan tables in particular should be tested at the national validation workshops.</w:t>
+      </w:r>
+    </w:p>
+    <w:p>
+      <w:pPr>
+        <w:pStyle w:val="Heading3"/>
+        <w:rPr/>
+      </w:pPr>
+      <w:r>
+        <w:rPr/>
+        <w:t>Angola: Cuando and Cubango</w:t>
+      </w:r>
+    </w:p>
+    <w:p>
+      <w:pPr>
+        <w:pStyle w:val="Normal"/>
+        <w:jc w:val="both"/>
+        <w:rPr/>
+      </w:pPr>
+      <w:r>
+        <w:rPr/>
+        <w:t>Tourism in Angola's KAZA component is nascent. Existing tourism MSMEs are guesthouses, restaurants and transport businesses in Menongue and Cuito Cuanavale, with emerging interest in river expeditions, birding, fishing and cultural and heritage tourism (Financial Landscape Analysis). Access is limited by poor roads, landmine contamination and sparse services, and bookings, guiding and logistics for Angola's flagship Luiana camp currently accrue in Namibia (MD p. 25, 118-119). Most enterprises are in Tiers 0 and 1. Banks ask for INAPEM certification before they lend (AllAfrica, 2026), and foreign shareholding in road passenger transport is capped at 49% (MD p. 26). The approach therefore has to be readiness first.</w:t>
+      </w:r>
+    </w:p>
+    <w:p>
+      <w:pPr>
+        <w:pStyle w:val="Normal"/>
+        <w:jc w:val="both"/>
+        <w:rPr/>
+      </w:pPr>
+      <w:r>
+        <w:rPr>
+          <w:b/>
+          <w:bCs/>
+        </w:rPr>
+        <w:t>Formalisation and certification</w:t>
+      </w:r>
+      <w:r>
+        <w:rPr/>
+        <w:t xml:space="preserve"> is a high priority. Tourism MSMEs in Cuando and Cubango need to register, obtain INAPEM certification, which banks ask for and which gives access to tax benefits, and obtain MINTUR licensing and classification for guesthouses and restaurants, none of which is easy from Menongue. Registration and certification clinics in Menongue and Cuito Cuanavale, with follow-up until each enterprise has completed the process, should be run by INAPEM with the BUE and Guiché Único, MINTUR and the provincial governments. </w:t>
+      </w:r>
+      <w:r>
+        <w:rPr>
+          <w:b/>
+          <w:bCs/>
+        </w:rPr>
+        <w:t>Basic business and financial management</w:t>
+      </w:r>
+      <w:r>
+        <w:rPr/>
+        <w:t xml:space="preserve"> is equally urgent: bookkeeping, separating business and household money, costing and pricing, and managing a seasonal income. A tourism module in INAPEM's incubator network, delivered in the province with on-site coaching, would meet this need, working with the Envolver+ network and Universidade Cuito Cuanavale.</w:t>
+      </w:r>
+    </w:p>
+    <w:p>
+      <w:pPr>
+        <w:pStyle w:val="Normal"/>
+        <w:jc w:val="both"/>
+        <w:rPr/>
+      </w:pPr>
+      <w:r>
+        <w:rPr>
+          <w:b/>
+          <w:bCs/>
+        </w:rPr>
+        <w:t>Guiding, expedition and logistics skills</w:t>
+      </w:r>
+      <w:r>
+        <w:rPr/>
+        <w:t xml:space="preserve"> are the third high priority, so that Angolan guides, boat operators and logistics providers can serve Luiana and the river systems and this business is no longer captured in Namibia. Training and certification, apprenticeships with operators on the Namibian side and with expedition partners, delivered with MINTUR, Universidade Cuito Cuanavale, the National Geographic Okavango Wilderness Project and Namibian operators and training institutions, are recommended. Of medium priority are </w:t>
+      </w:r>
+      <w:r>
+        <w:rPr>
+          <w:b/>
+          <w:bCs/>
+        </w:rPr>
+        <w:t>hospitality service standards</w:t>
+      </w:r>
+      <w:r>
+        <w:rPr/>
+        <w:t xml:space="preserve"> in guesthouses and restaurants, through workplace training linked to MINTUR classification with the hospitality associations and the university; </w:t>
+      </w:r>
+      <w:r>
+        <w:rPr>
+          <w:b/>
+          <w:bCs/>
+        </w:rPr>
+        <w:t>product development and market linkage</w:t>
+      </w:r>
+      <w:r>
+        <w:rPr/>
+        <w:t xml:space="preserve">, turning birding, fishing, river, cultural and heritage experiences into bookable products through familiarisation trips and learning visits to Namibian and Botswana destinations; and </w:t>
+      </w:r>
+      <w:r>
+        <w:rPr>
+          <w:b/>
+          <w:bCs/>
+        </w:rPr>
+        <w:t>community enterprise</w:t>
+      </w:r>
+      <w:r>
+        <w:rPr/>
+        <w:t xml:space="preserve"> governance and benefit-sharing, supported by ACADIR, local NGOs, The HALO Trust and traditional authorities. </w:t>
+      </w:r>
+      <w:r>
+        <w:rPr>
+          <w:b/>
+          <w:bCs/>
+        </w:rPr>
+        <w:t>Investment readiness</w:t>
+      </w:r>
+      <w:r>
+        <w:rPr/>
+        <w:t xml:space="preserve"> for FGC-guaranteed loans and micro-loans from KixiCrédito and Banco Sol should follow once enterprises are certified and trading.</w:t>
+      </w:r>
+    </w:p>
+    <w:p>
+      <w:pPr>
+        <w:pStyle w:val="Normal"/>
+        <w:jc w:val="both"/>
+        <w:rPr/>
+      </w:pPr>
+      <w:r>
+        <w:rPr>
+          <w:b/>
+          <w:bCs/>
+        </w:rPr>
+        <w:t>Support BSO gaps in Angola.</w:t>
+      </w:r>
+      <w:r>
+        <w:rPr/>
+        <w:t xml:space="preserve"> No tourism-specific BDS was identified in the KAZA area, INAPEM's decentralised incubation started in Huíla rather than Cuando Cubango, and the hospitality associations are Luanda-based (Section 7.3). The first need is a BSO presence in Menongue: an INAPEM desk or incubator node with a tourism module, working with MINTUR and the provincial governments.</w:t>
+      </w:r>
+    </w:p>
+    <w:p>
+      <w:pPr>
+        <w:pStyle w:val="Heading3"/>
+        <w:rPr/>
+      </w:pPr>
+      <w:r>
+        <w:rPr/>
+        <w:t>Botswana: Chobe District and Ngamiland</w:t>
+      </w:r>
+    </w:p>
+    <w:p>
+      <w:pPr>
+        <w:pStyle w:val="Normal"/>
+        <w:jc w:val="both"/>
+        <w:rPr/>
+      </w:pPr>
+      <w:r>
+        <w:rPr/>
+        <w:t>Botswana's KAZA component centres on Kasane and Maun, with high-value, low-volume tourism in the Okavango Delta, Chobe, Linyanti and Makgadikgadi. It has the strongest anchor-led procurement evidence in KAZA. Wilderness buys more than 80% of its supplies by value from Botswana-based suppliers, its supplier expo generated more than BWP 6.2 million of new contracts for citizen-owned businesses in its first year, and its suppliers can borrow from Stanbic Bank against their contracts (Section 7.2). Guesthouses and touristic transfer companies are reserved for citizens, which makes them MSME space that depends on domestic capital and lodge contracts (MD p. 32-34). Camp construction materials still come largely through South African intermediaries (MD p. 68), and a Maun craft hub connecting more than 100 artisans has export certifications but no committed international buyers (MD p. 69). Most tourism MSMEs are in Tiers 1 and 2. The PSDP survey (Section 6.1) is Botswana evidence and applies directly.</w:t>
+      </w:r>
+    </w:p>
+    <w:p>
+      <w:pPr>
+        <w:pStyle w:val="Normal"/>
+        <w:jc w:val="both"/>
+        <w:rPr/>
+      </w:pPr>
+      <w:r>
+        <w:rPr/>
+        <w:t xml:space="preserve">Three needs are of high priority in Botswana. </w:t>
+      </w:r>
+      <w:r>
+        <w:rPr>
+          <w:b/>
+          <w:bCs/>
+        </w:rPr>
+        <w:t>Supplier readiness for anchor camps</w:t>
+      </w:r>
+      <w:r>
+        <w:rPr/>
+        <w:t xml:space="preserve"> means meeting camp requirements for food, dry goods, beverages, building materials, laundry, maintenance and transfers in Kasane and Maun, and replacing South African intermediaries. Supplier development tied to named anchors' procurement plans, with supplier expos and nominated suppliers, should be led by LEA with Wilderness and other anchor operators, HATAB and WIBA. </w:t>
+      </w:r>
+      <w:r>
+        <w:rPr>
+          <w:b/>
+          <w:bCs/>
+        </w:rPr>
+        <w:t>Investment readiness and contract finance</w:t>
+      </w:r>
+      <w:r>
+        <w:rPr/>
+        <w:t xml:space="preserve"> covers loan packaging, using contracts as security and credit discipline after a loan. The Wilderness-Stanbic model of contract-backed finance should be extended to other anchors and banks, with an LEA-CEDA referral pipeline, coaching for CEDA's mentors and YDF for young entrepreneurs. </w:t>
+      </w:r>
+      <w:r>
+        <w:rPr>
+          <w:b/>
+          <w:bCs/>
+        </w:rPr>
+        <w:t>Quality, standards and grading</w:t>
+      </w:r>
+      <w:r>
+        <w:rPr/>
+        <w:t xml:space="preserve"> covers product testing and certification for food and goods suppliers and grading for citizen guesthouses; LEA, BOBS and BTO should deliver these services in Kasane and Maun rather than only in Gaborone.</w:t>
+      </w:r>
+    </w:p>
+    <w:p>
+      <w:pPr>
+        <w:pStyle w:val="Normal"/>
+        <w:jc w:val="both"/>
+        <w:rPr/>
+      </w:pPr>
+      <w:r>
+        <w:rPr/>
+        <w:t xml:space="preserve">Of medium priority are </w:t>
+      </w:r>
+      <w:r>
+        <w:rPr>
+          <w:b/>
+          <w:bCs/>
+        </w:rPr>
+        <w:t>crafts and cultural products</w:t>
+      </w:r>
+      <w:r>
+        <w:rPr/>
+        <w:t xml:space="preserve">, where the need is to move from generic curios to differentiated products with committed buyers, supported by BTO, the craft hubs, WIBA and BITC through market-led design, buyer brokerage and export packaging and branding; </w:t>
+      </w:r>
+      <w:r>
+        <w:rPr>
+          <w:b/>
+          <w:bCs/>
+        </w:rPr>
+        <w:t>guiding and mokoro services</w:t>
+      </w:r>
+      <w:r>
+        <w:rPr/>
+        <w:t xml:space="preserve">, through certification, lease-to-own equipment and digital listing with BTO, the Botswana Guides Association and the mokoro polers' trusts; </w:t>
+      </w:r>
+      <w:r>
+        <w:rPr>
+          <w:b/>
+          <w:bCs/>
+        </w:rPr>
+        <w:t>business management and productivity</w:t>
+      </w:r>
+      <w:r>
+        <w:rPr/>
+        <w:t xml:space="preserve">, through on-site coaching by LEA and BNPC; and </w:t>
+      </w:r>
+      <w:r>
+        <w:rPr>
+          <w:b/>
+          <w:bCs/>
+        </w:rPr>
+        <w:t>community trust enterprises</w:t>
+      </w:r>
+      <w:r>
+        <w:rPr/>
+        <w:t xml:space="preserve">, through governance, JV advisory and certification grants with BOCOBONET, CBNRM NGOs and BTO. </w:t>
+      </w:r>
+      <w:r>
+        <w:rPr>
+          <w:b/>
+          <w:bCs/>
+        </w:rPr>
+        <w:t>Voice and payment terms</w:t>
+      </w:r>
+      <w:r>
+        <w:rPr/>
+        <w:t xml:space="preserve"> are of lower priority but matter for suppliers: a tourism desk in Business Botswana and supplier representation in HATAB's dialogue with its members would carry these issues to anchors and government.</w:t>
+      </w:r>
+    </w:p>
+    <w:p>
+      <w:pPr>
+        <w:pStyle w:val="Normal"/>
+        <w:jc w:val="both"/>
+        <w:rPr/>
+      </w:pPr>
+      <w:r>
+        <w:rPr>
+          <w:b/>
+          <w:bCs/>
+        </w:rPr>
+        <w:t>Support BSO gaps in Botswana.</w:t>
+      </w:r>
+      <w:r>
+        <w:rPr/>
+        <w:t xml:space="preserve"> LEA is the natural lead, but needs tourism supplier-development staff in Kasane and Maun and accredited consultants. HATAB needs the strategic plan and performance system the PSDP survey identified before it can host supplier development. BOBS and BNPC need delivery partners in the KAZA hubs, and LEA and CEDA need a working referral agreement (Section 6.2).</w:t>
+      </w:r>
+    </w:p>
+    <w:p>
+      <w:pPr>
+        <w:pStyle w:val="Heading3"/>
+        <w:rPr/>
+      </w:pPr>
+      <w:r>
+        <w:rPr/>
+        <w:t>Namibia: Zambezi and Kavango East</w:t>
+      </w:r>
+    </w:p>
+    <w:p>
+      <w:pPr>
+        <w:pStyle w:val="Normal"/>
+        <w:jc w:val="both"/>
+        <w:rPr/>
+      </w:pPr>
+      <w:r>
+        <w:rPr/>
+        <w:t>Namibia's KAZA component spans the Zambezi Region and Kavango East, with Katima Mulilo, Rundu, Divundu and Kongola as hubs and a dense network of conservancies. The gaps are clearest in lodge-linked goods: about 80% of lodge design and décor items in the Kavango and Zambezi regions are imported because local suppliers cannot match imports on consistency, quality, scale and price (MD p. 70, 128). Community SMMEs capture little value: craft, soap and oil, textile, village-tour and taxi enterprises together earn under 1% of conservancy returns, against 59.7% from joint-venture lodges (MD p. 37, 40). Company registration is slow (Section 7.1), and the end of visa-free travel for 31 countries in April 2025 has shifted demand (Section 7.2). Gondwana's sourcing at its Etosha lodge shows that local suppliers can meet lodge specifications when sourcing is designed in from the start (Section 7.2).</w:t>
+      </w:r>
+    </w:p>
+    <w:p>
+      <w:pPr>
+        <w:pStyle w:val="Normal"/>
+        <w:jc w:val="both"/>
+        <w:rPr/>
+      </w:pPr>
+      <w:r>
+        <w:rPr/>
+        <w:t xml:space="preserve">Three needs are of high priority in Namibia. </w:t>
+      </w:r>
+      <w:r>
+        <w:rPr>
+          <w:b/>
+          <w:bCs/>
+        </w:rPr>
+        <w:t>Lodge-linked goods to specification</w:t>
+      </w:r>
+      <w:r>
+        <w:rPr/>
+        <w:t xml:space="preserve"> means décor, furnishings, building materials and gifts that match imports on consistency, quality, scale and price. Design and quality coaching with lodge procurement teams, specifications agreed in advance and tooling finance should be delivered by NIPDB with the chamber's Zambezi and Kavango branches and lodge operators. </w:t>
+      </w:r>
+      <w:r>
+        <w:rPr>
+          <w:b/>
+          <w:bCs/>
+        </w:rPr>
+        <w:t>Moving from conservancy benefit to enterprise</w:t>
+      </w:r>
+      <w:r>
+        <w:rPr/>
+        <w:t xml:space="preserve"> means turning conservancy crafts, soap and oil, textiles, village tours and taxis into commercial enterprises that sell to lodges, through a pathway of governance, business skills and buyer links run by NIPDB with NACSO, IRDNC, NNF and the conservancies. </w:t>
+      </w:r>
+      <w:r>
+        <w:rPr>
+          <w:b/>
+          <w:bCs/>
+        </w:rPr>
+        <w:t>Formalisation</w:t>
+      </w:r>
+      <w:r>
+        <w:rPr/>
+        <w:t xml:space="preserve"> needs practical help with registration at BIPA, and with staying compliant to avoid de-registration, through the chamber's regional branches.</w:t>
+      </w:r>
+    </w:p>
+    <w:p>
+      <w:pPr>
+        <w:pStyle w:val="Normal"/>
+        <w:jc w:val="both"/>
+        <w:rPr/>
+      </w:pPr>
+      <w:r>
+        <w:rPr/>
+        <w:t xml:space="preserve">Of medium priority are </w:t>
+      </w:r>
+      <w:r>
+        <w:rPr>
+          <w:b/>
+          <w:bCs/>
+        </w:rPr>
+        <w:t>market diversification</w:t>
+      </w:r>
+      <w:r>
+        <w:rPr/>
+        <w:t xml:space="preserve">, through product inclusion in DMC itineraries, supply to several lodges and marketing support with NTB, FENATA, HAN, TASA and DMCs; </w:t>
+      </w:r>
+      <w:r>
+        <w:rPr>
+          <w:b/>
+          <w:bCs/>
+        </w:rPr>
+        <w:t>nature-positive products</w:t>
+      </w:r>
+      <w:r>
+        <w:rPr/>
+        <w:t xml:space="preserve">, through certification and equipment grants and producer-group support with NNF, IRDNC, EIF and CCFN; </w:t>
+      </w:r>
+      <w:r>
+        <w:rPr>
+          <w:b/>
+          <w:bCs/>
+        </w:rPr>
+        <w:t>guiding and hospitality skills</w:t>
+      </w:r>
+      <w:r>
+        <w:rPr/>
+        <w:t xml:space="preserve">, through skills-to-enterprise tracks with the Namibia Training Authority, UNAM's Katima Mulilo campus, the NUST hospitality school and NTB; and </w:t>
+      </w:r>
+      <w:r>
+        <w:rPr>
+          <w:b/>
+          <w:bCs/>
+        </w:rPr>
+        <w:t>investment readiness</w:t>
+      </w:r>
+      <w:r>
+        <w:rPr/>
+        <w:t xml:space="preserve">, through pitch coaching linked to the SME fund, the High Potential Pool, DBN and the credit guarantee scheme. </w:t>
+      </w:r>
+      <w:r>
+        <w:rPr>
+          <w:b/>
+          <w:bCs/>
+        </w:rPr>
+        <w:t>Waste and recycling services</w:t>
+      </w:r>
+      <w:r>
+        <w:rPr/>
+        <w:t>, supported by regional councils, lodges and NGOs, are a lower priority with a smaller evidence base.</w:t>
+      </w:r>
+    </w:p>
+    <w:p>
+      <w:pPr>
+        <w:pStyle w:val="Normal"/>
+        <w:jc w:val="both"/>
+        <w:rPr/>
+      </w:pPr>
+      <w:r>
+        <w:rPr>
+          <w:b/>
+          <w:bCs/>
+        </w:rPr>
+        <w:t>Support BSO gaps in Namibia.</w:t>
+      </w:r>
+      <w:r>
+        <w:rPr/>
+        <w:t xml:space="preserve"> NIPDB's programmes are national and not tourism-specific, so a KAZA supplier-development service has to be built with the conservancy support organisations and lodge operators (Section 7.3). The chamber's regional branches are the most practical local delivery point, but need advisers trained in tourism supply and registration support.</w:t>
+      </w:r>
+    </w:p>
+    <w:p>
+      <w:pPr>
+        <w:pStyle w:val="Heading3"/>
+        <w:rPr/>
+      </w:pPr>
+      <w:r>
+        <w:rPr/>
+        <w:t>Zambia: Livingstone and the southern KAZA area</w:t>
+      </w:r>
+    </w:p>
+    <w:p>
+      <w:pPr>
+        <w:pStyle w:val="Normal"/>
+        <w:jc w:val="both"/>
+        <w:rPr/>
+      </w:pPr>
+      <w:r>
+        <w:rPr/>
+        <w:t>Zambia's KAZA tourism MSMEs are concentrated in Livingstone and along the Victoria Falls-Kazungula corridor, with community enterprise around Simalaha and Sioma Ngwezi. Linkages with hotels are better documented here than in most destinations: a Livingstone hotel buys produce directly from smallholders, and a women's mushroom farm sells most of its produce to hotels under long-term contracts (Section 7.2). A women's forest-products cooperative sells mungongo oil and baobab coffee to Livingstone hotels and export buyers but cannot finance a ZMW 30,000 certification quote (MD p. 73). Licensing is the main regulatory burden, and omnibus licensing for accommodation is under discussion (Section 7.1). Women lead more than 60% of Zambia's MSMEs (AFI), and youth BDS is emerging through UNDP's youth-led MSME programme in Livingstone (Section 7.3).</w:t>
+      </w:r>
+    </w:p>
+    <w:p>
+      <w:pPr>
+        <w:pStyle w:val="Normal"/>
+        <w:jc w:val="both"/>
+        <w:rPr/>
+      </w:pPr>
+      <w:r>
+        <w:rPr/>
+        <w:t xml:space="preserve">Three needs are of high priority in Zambia. </w:t>
+      </w:r>
+      <w:r>
+        <w:rPr>
+          <w:b/>
+          <w:bCs/>
+        </w:rPr>
+        <w:t>Smallholder aggregation and hotel supply</w:t>
+      </w:r>
+      <w:r>
+        <w:rPr/>
+        <w:t xml:space="preserve"> means moving smallholders from individual spot sales to organised, consistent supply under agreements with Livingstone hotels, through producer-group formation, supply agreements and post-harvest and quality coaching led by ZDA and CEEC with the Livingstone Tourism Association and hotels. </w:t>
+      </w:r>
+      <w:r>
+        <w:rPr>
+          <w:b/>
+          <w:bCs/>
+        </w:rPr>
+        <w:t>Certification and export readiness</w:t>
+      </w:r>
+      <w:r>
+        <w:rPr/>
+        <w:t xml:space="preserve"> for nature-positive products such as forest products needs certification grants, quality-assurance coaching and links to COMESA and regional markets, delivered by ZDA, CEEC and Peace Parks Foundation. </w:t>
+      </w:r>
+      <w:r>
+        <w:rPr>
+          <w:b/>
+          <w:bCs/>
+        </w:rPr>
+        <w:t>Youth enterprise in tourism services</w:t>
+      </w:r>
+      <w:r>
+        <w:rPr/>
+        <w:t>, in guiding, transfers, digital marketing and services, should build on the UNDP youth programme in Livingstone, with ZDA, BongoHive, the Hotel and Tourism Training Institute and the Livingstone tourism university providing incubation and apprenticeships.</w:t>
+      </w:r>
+    </w:p>
+    <w:p>
+      <w:pPr>
+        <w:pStyle w:val="Normal"/>
+        <w:jc w:val="both"/>
+        <w:rPr/>
+      </w:pPr>
+      <w:r>
+        <w:rPr/>
+        <w:t xml:space="preserve">Of medium priority are </w:t>
+      </w:r>
+      <w:r>
+        <w:rPr>
+          <w:b/>
+          <w:bCs/>
+        </w:rPr>
+        <w:t>licensing and compliance</w:t>
+      </w:r>
+      <w:r>
+        <w:rPr/>
+        <w:t xml:space="preserve">, through help at the point of need from the BRRA, the Ministry of Tourism and ZDA, with TCZ and ZCSMBA advocating omnibus licensing; </w:t>
+      </w:r>
+      <w:r>
+        <w:rPr>
+          <w:b/>
+          <w:bCs/>
+        </w:rPr>
+        <w:t>guiding and hospitality service quality</w:t>
+      </w:r>
+      <w:r>
+        <w:rPr/>
+        <w:t xml:space="preserve">, through certification and workplace training with the training institutions and tour operator associations; </w:t>
+      </w:r>
+      <w:r>
+        <w:rPr>
+          <w:b/>
+          <w:bCs/>
+        </w:rPr>
+        <w:t>women-led enterprise finance</w:t>
+      </w:r>
+      <w:r>
+        <w:rPr/>
+        <w:t xml:space="preserve">, through bookkeeping and mobile-money training and links to women's finance windows and the ZCGS, with CEEC, ZCSMBA and partner lenders; </w:t>
+      </w:r>
+      <w:r>
+        <w:rPr>
+          <w:b/>
+          <w:bCs/>
+        </w:rPr>
+        <w:t>investment readiness and seasonal finance</w:t>
+      </w:r>
+      <w:r>
+        <w:rPr/>
+        <w:t xml:space="preserve">, through coaching and seasonal terms in CEEC products; and </w:t>
+      </w:r>
+      <w:r>
+        <w:rPr>
+          <w:b/>
+          <w:bCs/>
+        </w:rPr>
+        <w:t>community enterprise</w:t>
+      </w:r>
+      <w:r>
+        <w:rPr/>
+        <w:t xml:space="preserve"> in conservancy areas, with Peace Parks Foundation and traditional authorities. </w:t>
+      </w:r>
+      <w:r>
+        <w:rPr>
+          <w:b/>
+          <w:bCs/>
+        </w:rPr>
+        <w:t>Cross-border small trade</w:t>
+      </w:r>
+      <w:r>
+        <w:rPr/>
+        <w:t xml:space="preserve"> under the COMESA Simplified Trade Regime is a lower but specific need for women traders at Victoria Falls and Kazungula.</w:t>
+      </w:r>
+    </w:p>
+    <w:p>
+      <w:pPr>
+        <w:pStyle w:val="Normal"/>
+        <w:jc w:val="both"/>
+        <w:rPr/>
+      </w:pPr>
+      <w:r>
+        <w:rPr>
+          <w:b/>
+          <w:bCs/>
+        </w:rPr>
+        <w:t>Support BSO gaps in Zambia.</w:t>
+      </w:r>
+      <w:r>
+        <w:rPr/>
+        <w:t xml:space="preserve"> The ZDA-CEEC agreement combines BDS with finance, but is national rather than tourism-specific, and CEEC products are not yet designed around the tourism season. Tourism associations in Livingstone represent operators but rarely provide supplier development (Section 7.3). A Livingstone-based supplier-development service, run by ZDA and CEEC with the Livingstone Tourism Association, would close this gap.</w:t>
+      </w:r>
+    </w:p>
+    <w:p>
+      <w:pPr>
+        <w:pStyle w:val="Heading3"/>
+        <w:rPr/>
+      </w:pPr>
+      <w:r>
+        <w:rPr/>
+        <w:t>Zimbabwe: Victoria Falls, Hwange and Binga</w:t>
+      </w:r>
+    </w:p>
+    <w:p>
+      <w:pPr>
+        <w:pStyle w:val="Normal"/>
+        <w:jc w:val="both"/>
+        <w:rPr/>
+      </w:pPr>
+      <w:r>
+        <w:rPr/>
+        <w:t>Zimbabwe's KAZA tourism MSMEs are concentrated around Victoria Falls, Hwange and Binga and in the CAMPFIRE districts. Anchor demand is clear: a Hwange anchor lodge calls irrigated fruit and vegetable supply the clearest near-term opportunity because sourcing from Bulawayo brings delays and quality problems, and new suppliers need only two or three successful bookings to be listed regularly (MD p. 75). Informality carries a heavy penalty: an anchor operator reports a 30% withholding tax on payments to suppliers without tax clearance (MD p. 74). Only about one in seven MSMEs is registered (FinScope MSME Zimbabwe 2022), only 17% always keep records, and women own more than 60% of MSMEs, most of them informal (Chapters 4 and 5). Passenger transport and local arts and crafts are reserved for citizens (Section 7.1), and currency instability complicates lending (Section 7.4).</w:t>
+      </w:r>
+    </w:p>
+    <w:p>
+      <w:pPr>
+        <w:pStyle w:val="Normal"/>
+        <w:jc w:val="both"/>
+        <w:rPr/>
+      </w:pPr>
+      <w:r>
+        <w:rPr/>
+        <w:t xml:space="preserve">Three needs are of high priority in Zimbabwe. </w:t>
+      </w:r>
+      <w:r>
+        <w:rPr>
+          <w:b/>
+          <w:bCs/>
+        </w:rPr>
+        <w:t>Tax clearance and formalisation</w:t>
+      </w:r>
+      <w:r>
+        <w:rPr/>
+        <w:t xml:space="preserve"> comes first, so that suppliers avoid the 30% withholding tax and can be contracted by anchors; SMEDCO should take enterprises through the ZIDA one-stop centre and ZIMRA, with the Victoria Falls City Council and the RDCs for local licences. </w:t>
+      </w:r>
+      <w:r>
+        <w:rPr>
+          <w:b/>
+          <w:bCs/>
+        </w:rPr>
+        <w:t>Irrigated produce supply to lodges</w:t>
+      </w:r>
+      <w:r>
+        <w:rPr/>
+        <w:t xml:space="preserve"> in Hwange and Victoria Falls needs irrigation, aggregation, consistent quality and supply agreements, supported by SMEDCO, anchor lodges, Lupane State University and agricultural extension. </w:t>
+      </w:r>
+      <w:r>
+        <w:rPr>
+          <w:b/>
+          <w:bCs/>
+        </w:rPr>
+        <w:t>Records and financial management</w:t>
+      </w:r>
+      <w:r>
+        <w:rPr/>
+        <w:t>, including cash-flow management in foreign currency, needs bookkeeping and mobile-money training with on-site follow-up from SMEDCO and the Ministry of Women Affairs, Community, Small and Medium Enterprises Development.</w:t>
+      </w:r>
+    </w:p>
+    <w:p>
+      <w:pPr>
+        <w:pStyle w:val="Normal"/>
+        <w:jc w:val="both"/>
+        <w:rPr/>
+      </w:pPr>
+      <w:r>
+        <w:rPr/>
+        <w:t xml:space="preserve">Of medium priority are </w:t>
+      </w:r>
+      <w:r>
+        <w:rPr>
+          <w:b/>
+          <w:bCs/>
+        </w:rPr>
+        <w:t>supplier listing and marketing</w:t>
+      </w:r>
+      <w:r>
+        <w:rPr/>
+        <w:t xml:space="preserve">, through sub-contracts, apprenticeships and joint marketing with TBCZ, ZTA, ZimTrade and DMCs; </w:t>
+      </w:r>
+      <w:r>
+        <w:rPr>
+          <w:b/>
+          <w:bCs/>
+        </w:rPr>
+        <w:t>guiding standards</w:t>
+      </w:r>
+      <w:r>
+        <w:rPr/>
+        <w:t xml:space="preserve">, through certification with the guides' and safari operators' associations and ZTA; </w:t>
+      </w:r>
+      <w:r>
+        <w:rPr>
+          <w:b/>
+          <w:bCs/>
+        </w:rPr>
+        <w:t>crafts and CAMPFIRE community enterprise</w:t>
+      </w:r>
+      <w:r>
+        <w:rPr/>
+        <w:t xml:space="preserve">, through market-led design, buyer links and governance support with the CAMPFIRE Association, the RDCs and ZimTrade; </w:t>
+      </w:r>
+      <w:r>
+        <w:rPr>
+          <w:b/>
+          <w:bCs/>
+        </w:rPr>
+        <w:t>women-led enterprises</w:t>
+      </w:r>
+      <w:r>
+        <w:rPr/>
+        <w:t xml:space="preserve">, through a group-to-enterprise pathway and links to the Zimbabwe Women's Microfinance Bank; and </w:t>
+      </w:r>
+      <w:r>
+        <w:rPr>
+          <w:b/>
+          <w:bCs/>
+        </w:rPr>
+        <w:t>investment readiness and finance</w:t>
+      </w:r>
+      <w:r>
+        <w:rPr/>
+        <w:t xml:space="preserve">, through SMEDCO's support, including for ZEEX, ECGC-guaranteed lending and EmpowerBank. </w:t>
+      </w:r>
+      <w:r>
+        <w:rPr>
+          <w:b/>
+          <w:bCs/>
+        </w:rPr>
+        <w:t>Cross-border small trade</w:t>
+      </w:r>
+      <w:r>
+        <w:rPr/>
+        <w:t xml:space="preserve"> under the Simplified Trade Regime is a lower priority, supported by ZimTrade and ZIMRA.</w:t>
+      </w:r>
+    </w:p>
+    <w:p>
+      <w:pPr>
+        <w:pStyle w:val="Normal"/>
+        <w:jc w:val="both"/>
+        <w:rPr/>
+      </w:pPr>
+      <w:r>
+        <w:rPr>
+          <w:b/>
+          <w:bCs/>
+        </w:rPr>
+        <w:t>Support BSO gaps in Zimbabwe.</w:t>
+      </w:r>
+      <w:r>
+        <w:rPr/>
+        <w:t xml:space="preserve"> SMEDCO combines lending with capacity building, but its presence in Victoria Falls and Hwange is limited, and its mentoring, like that of other lender-BSOs, tends to follow a loan (Section 6.2). The tourism associations represent operators but do not run supplier development. A supplier-development service for Victoria Falls and Hwange, run by SMEDCO with ZIDA, TBCZ and the CAMPFIRE Association, is the main gap.</w:t>
+      </w:r>
+    </w:p>
+    <w:p>
+      <w:pPr>
+        <w:pStyle w:val="Heading3"/>
+        <w:rPr/>
+      </w:pPr>
+      <w:r>
+        <w:rPr/>
+        <w:t>Comparison across the five countries</w:t>
+      </w:r>
+    </w:p>
+    <w:p>
+      <w:pPr>
+        <w:pStyle w:val="Normal"/>
+        <w:jc w:val="both"/>
+        <w:rPr/>
+      </w:pPr>
+      <w:r>
+        <w:rPr>
+          <w:b/>
+          <w:bCs/>
+        </w:rPr>
+        <w:t>Comparing the five countries,</w:t>
+      </w:r>
+      <w:r>
+        <w:rPr/>
+        <w:t xml:space="preserve"> formalisation, licensing and tax clearance are a high priority in Angola, Namibia and Zimbabwe, where certification, slow registration and the withholding tax respectively stand between MSMEs and anchor contracts, but a lower priority in Botswana, where registration is online and the binding needs are supplier readiness, standards and contract finance. Supplier readiness and aggregation for lodges is a high priority everywhere except Angola, where the tourism market is too young and the priorities are basic business management, formalisation and guiding skills. Quality, standards and certification are most pressing in Botswana and Zambia, community enterprise in Namibia's conservancies, investment readiness in Botswana, where contract finance is already available, and women and youth enterprise in Zambia, where women lead most MSMEs and a youth programme is already running in Livingstone. The proposed lead BSOs are INAPEM in Angola, LEA in Botswana, NIPDB in Namibia, ZDA and CEEC in Zambia and SMEDCO in Zimbabwe.</w:t>
+      </w:r>
       <w:r>
         <w:br w:type="page"/>
       </w:r>
@@ -6868,8 +7962,8 @@
         <w:spacing w:before="0" w:after="240"/>
         <w:rPr/>
       </w:pPr>
-      <w:bookmarkStart w:id="26" w:name="__RefHeading___Toc1165_4016896087"/>
-      <w:bookmarkEnd w:id="26"/>
+      <w:bookmarkStart w:id="27" w:name="__RefHeading___Toc1305_3920751122"/>
+      <w:bookmarkEnd w:id="27"/>
       <w:r>
         <w:rPr/>
         <w:t>7. Enabling Environment</w:t>
@@ -6891,8 +7985,8 @@
         <w:pStyle w:val="Heading2"/>
         <w:rPr/>
       </w:pPr>
-      <w:bookmarkStart w:id="27" w:name="__RefHeading___Toc1167_4016896087"/>
-      <w:bookmarkEnd w:id="27"/>
+      <w:bookmarkStart w:id="28" w:name="__RefHeading___Toc1307_3920751122"/>
+      <w:bookmarkEnd w:id="28"/>
       <w:r>
         <w:rPr/>
         <w:t>7.1 National and Regional Regulatory Frameworks</w:t>
@@ -7433,8 +8527,8 @@
         <w:pStyle w:val="Heading2"/>
         <w:rPr/>
       </w:pPr>
-      <w:bookmarkStart w:id="28" w:name="__RefHeading___Toc1169_4016896087"/>
-      <w:bookmarkEnd w:id="28"/>
+      <w:bookmarkStart w:id="29" w:name="__RefHeading___Toc1309_3920751122"/>
+      <w:bookmarkEnd w:id="29"/>
       <w:r>
         <w:rPr/>
         <w:t>7.2 Market Access and Linkages with Larger Operators</w:t>
@@ -7677,8 +8771,8 @@
         <w:pStyle w:val="Heading2"/>
         <w:rPr/>
       </w:pPr>
-      <w:bookmarkStart w:id="29" w:name="__RefHeading___Toc1171_4016896087"/>
-      <w:bookmarkEnd w:id="29"/>
+      <w:bookmarkStart w:id="30" w:name="__RefHeading___Toc1311_3920751122"/>
+      <w:bookmarkEnd w:id="30"/>
       <w:r>
         <w:rPr/>
         <w:t>7.3 Business Development Services</w:t>
@@ -8287,8 +9381,8 @@
         <w:pStyle w:val="Heading2"/>
         <w:rPr/>
       </w:pPr>
-      <w:bookmarkStart w:id="30" w:name="__RefHeading___Toc1173_4016896087"/>
-      <w:bookmarkEnd w:id="30"/>
+      <w:bookmarkStart w:id="31" w:name="__RefHeading___Toc1313_3920751122"/>
+      <w:bookmarkEnd w:id="31"/>
       <w:r>
         <w:rPr/>
         <w:t>7.4 Policy Conditions</w:t>
@@ -8373,8 +9467,8 @@
         <w:spacing w:before="0" w:after="240"/>
         <w:rPr/>
       </w:pPr>
-      <w:bookmarkStart w:id="31" w:name="__RefHeading___Toc1175_4016896087"/>
-      <w:bookmarkEnd w:id="31"/>
+      <w:bookmarkStart w:id="32" w:name="__RefHeading___Toc1315_3920751122"/>
+      <w:bookmarkEnd w:id="32"/>
       <w:r>
         <w:rPr/>
         <w:t>8. Readiness for Financial Products</w:t>
@@ -8385,8 +9479,8 @@
         <w:pStyle w:val="Heading2"/>
         <w:rPr/>
       </w:pPr>
-      <w:bookmarkStart w:id="32" w:name="__RefHeading___Toc1177_4016896087"/>
-      <w:bookmarkEnd w:id="32"/>
+      <w:bookmarkStart w:id="33" w:name="__RefHeading___Toc1317_3920751122"/>
+      <w:bookmarkEnd w:id="33"/>
       <w:r>
         <w:rPr/>
         <w:t>8.1 The Effect of Seasonality on Debt</w:t>
@@ -8503,8 +9597,8 @@
         <w:pStyle w:val="Heading2"/>
         <w:rPr/>
       </w:pPr>
-      <w:bookmarkStart w:id="33" w:name="__RefHeading___Toc1179_4016896087"/>
-      <w:bookmarkEnd w:id="33"/>
+      <w:bookmarkStart w:id="34" w:name="__RefHeading___Toc1319_3920751122"/>
+      <w:bookmarkEnd w:id="34"/>
       <w:r>
         <w:rPr/>
         <w:t>8.2 MSME Readiness by Product</w:t>
@@ -8580,8 +9674,8 @@
         <w:pStyle w:val="Heading2"/>
         <w:rPr/>
       </w:pPr>
-      <w:bookmarkStart w:id="34" w:name="__RefHeading___Toc1181_4016896087"/>
-      <w:bookmarkEnd w:id="34"/>
+      <w:bookmarkStart w:id="35" w:name="__RefHeading___Toc1321_3920751122"/>
+      <w:bookmarkEnd w:id="35"/>
       <w:r>
         <w:rPr/>
         <w:t>8.3 Financial Institution Readiness by Product</w:t>
@@ -8695,8 +9789,8 @@
         <w:spacing w:before="0" w:after="240"/>
         <w:rPr/>
       </w:pPr>
-      <w:bookmarkStart w:id="35" w:name="__RefHeading___Toc1183_4016896087"/>
-      <w:bookmarkEnd w:id="35"/>
+      <w:bookmarkStart w:id="36" w:name="__RefHeading___Toc1323_3920751122"/>
+      <w:bookmarkEnd w:id="36"/>
       <w:r>
         <w:rPr/>
         <w:t>9. Scalable Women- and Youth-Led Models</w:t>
@@ -8995,8 +10089,8 @@
         <w:spacing w:before="0" w:after="240"/>
         <w:rPr/>
       </w:pPr>
-      <w:bookmarkStart w:id="36" w:name="__RefHeading___Toc1185_4016896087"/>
-      <w:bookmarkEnd w:id="36"/>
+      <w:bookmarkStart w:id="37" w:name="__RefHeading___Toc1325_3920751122"/>
+      <w:bookmarkEnd w:id="37"/>
       <w:r>
         <w:rPr/>
         <w:t>10. Recommended Capacity-Building Interventions</w:t>
@@ -9007,8 +10101,8 @@
         <w:pStyle w:val="Heading2"/>
         <w:rPr/>
       </w:pPr>
-      <w:bookmarkStart w:id="37" w:name="__RefHeading___Toc1187_4016896087"/>
-      <w:bookmarkEnd w:id="37"/>
+      <w:bookmarkStart w:id="38" w:name="__RefHeading___Toc1327_3920751122"/>
+      <w:bookmarkEnd w:id="38"/>
       <w:r>
         <w:rPr/>
         <w:t>10.1 A Tiered Readiness Pathway</w:t>
@@ -9102,8 +10196,8 @@
         <w:pStyle w:val="Heading2"/>
         <w:rPr/>
       </w:pPr>
-      <w:bookmarkStart w:id="38" w:name="__RefHeading___Toc1189_4016896087"/>
-      <w:bookmarkEnd w:id="38"/>
+      <w:bookmarkStart w:id="39" w:name="__RefHeading___Toc1329_3920751122"/>
+      <w:bookmarkEnd w:id="39"/>
       <w:r>
         <w:rPr/>
         <w:t>10.2 Gender-Transformative Approaches</w:t>
@@ -9282,8 +10376,8 @@
         <w:pStyle w:val="Heading2"/>
         <w:rPr/>
       </w:pPr>
-      <w:bookmarkStart w:id="39" w:name="__RefHeading___Toc1191_4016896087"/>
-      <w:bookmarkEnd w:id="39"/>
+      <w:bookmarkStart w:id="40" w:name="__RefHeading___Toc1331_3920751122"/>
+      <w:bookmarkEnd w:id="40"/>
       <w:r>
         <w:rPr/>
         <w:t>10.3 Youth-Focused Incubation</w:t>
@@ -9420,8 +10514,8 @@
         <w:pStyle w:val="Heading2"/>
         <w:rPr/>
       </w:pPr>
-      <w:bookmarkStart w:id="40" w:name="__RefHeading___Toc1193_4016896087"/>
-      <w:bookmarkEnd w:id="40"/>
+      <w:bookmarkStart w:id="41" w:name="__RefHeading___Toc1333_3920751122"/>
+      <w:bookmarkEnd w:id="41"/>
       <w:r>
         <w:rPr/>
         <w:t>10.4 Blended Support Packages</w:t>
@@ -9497,8 +10591,8 @@
         <w:pStyle w:val="Heading2"/>
         <w:rPr/>
       </w:pPr>
-      <w:bookmarkStart w:id="41" w:name="__RefHeading___Toc1195_4016896087"/>
-      <w:bookmarkEnd w:id="41"/>
+      <w:bookmarkStart w:id="42" w:name="__RefHeading___Toc1335_3920751122"/>
+      <w:bookmarkEnd w:id="42"/>
       <w:r>
         <w:rPr/>
         <w:t>10.5 BSO Strengthening</w:t>
@@ -9804,7 +10898,7 @@
       </w:pPr>
       <w:r>
         <w:rPr/>
-        <w:t>The programme should work through existing BSOs rather than create new ones. A lead BSO and a first strengthening focus are proposed for each country, based on Section 7.3.</w:t>
+        <w:t>The programme should work through existing BSOs rather than create new ones. A lead BSO and a first strengthening focus are proposed for each country, based on Section 7.3. Section 6.4 sets out, country by country, the tourism MSME needs that these BSOs should address, the recommended interventions and the partner BSOs for each.</w:t>
       </w:r>
     </w:p>
     <w:p>
@@ -9881,8 +10975,8 @@
         <w:pStyle w:val="Heading2"/>
         <w:rPr/>
       </w:pPr>
-      <w:bookmarkStart w:id="42" w:name="__RefHeading___Toc1197_4016896087"/>
-      <w:bookmarkEnd w:id="42"/>
+      <w:bookmarkStart w:id="43" w:name="__RefHeading___Toc1337_3920751122"/>
+      <w:bookmarkEnd w:id="43"/>
       <w:r>
         <w:rPr/>
         <w:t>10.6 Financial Institution Strengthening</w:t>
@@ -10031,8 +11125,8 @@
         <w:pStyle w:val="Heading2"/>
         <w:rPr/>
       </w:pPr>
-      <w:bookmarkStart w:id="43" w:name="__RefHeading___Toc1199_4016896087"/>
-      <w:bookmarkEnd w:id="43"/>
+      <w:bookmarkStart w:id="44" w:name="__RefHeading___Toc1339_3920751122"/>
+      <w:bookmarkEnd w:id="44"/>
       <w:r>
         <w:rPr/>
         <w:t>10.7 Enabling Environment and Market Linkage Actions</w:t>
@@ -10159,8 +11253,8 @@
         <w:pStyle w:val="Heading2"/>
         <w:rPr/>
       </w:pPr>
-      <w:bookmarkStart w:id="44" w:name="__RefHeading___Toc1201_4016896087"/>
-      <w:bookmarkEnd w:id="44"/>
+      <w:bookmarkStart w:id="45" w:name="__RefHeading___Toc1341_3920751122"/>
+      <w:bookmarkEnd w:id="45"/>
       <w:r>
         <w:rPr/>
         <w:t>10.8 Pathways to Financing</w:t>
@@ -10266,8 +11360,8 @@
         <w:pStyle w:val="Heading2"/>
         <w:rPr/>
       </w:pPr>
-      <w:bookmarkStart w:id="45" w:name="__RefHeading___Toc1203_4016896087"/>
-      <w:bookmarkEnd w:id="45"/>
+      <w:bookmarkStart w:id="46" w:name="__RefHeading___Toc1343_3920751122"/>
+      <w:bookmarkEnd w:id="46"/>
       <w:r>
         <w:rPr/>
         <w:t>10.9 Priorities and Next Steps</w:t>
@@ -10408,8 +11502,8 @@
         <w:spacing w:before="0" w:after="240"/>
         <w:rPr/>
       </w:pPr>
-      <w:bookmarkStart w:id="46" w:name="__RefHeading___Toc1205_4016896087"/>
-      <w:bookmarkEnd w:id="46"/>
+      <w:bookmarkStart w:id="47" w:name="__RefHeading___Toc1345_3920751122"/>
+      <w:bookmarkEnd w:id="47"/>
       <w:r>
         <w:rPr/>
         <w:t>Annex A: Evidence Map</w:t>
@@ -10457,8 +11551,8 @@
         <w:spacing w:before="0" w:after="240"/>
         <w:rPr/>
       </w:pPr>
-      <w:bookmarkStart w:id="47" w:name="__RefHeading___Toc1207_4016896087"/>
-      <w:bookmarkEnd w:id="47"/>
+      <w:bookmarkStart w:id="48" w:name="__RefHeading___Toc1347_3920751122"/>
+      <w:bookmarkEnd w:id="48"/>
       <w:r>
         <w:rPr/>
         <w:t>Annex B: Closing the Gender and Age Data Gap</w:t>
@@ -10604,8 +11698,8 @@
         <w:spacing w:before="0" w:after="240"/>
         <w:rPr/>
       </w:pPr>
-      <w:bookmarkStart w:id="48" w:name="__RefHeading___Toc1209_4016896087"/>
-      <w:bookmarkEnd w:id="48"/>
+      <w:bookmarkStart w:id="49" w:name="__RefHeading___Toc1349_3920751122"/>
+      <w:bookmarkEnd w:id="49"/>
       <w:r>
         <w:rPr/>
         <w:t>References</w:t>
@@ -11795,7 +12889,7 @@
     </w:r>
     <w:r>
       <w:rPr/>
-      <w:t>53</w:t>
+      <w:t>58</w:t>
     </w:r>
     <w:r>
       <w:rPr/>
@@ -11851,7 +12945,7 @@
     </w:r>
     <w:r>
       <w:rPr/>
-      <w:t>53</w:t>
+      <w:t>58</w:t>
     </w:r>
     <w:r>
       <w:rPr/>
@@ -11875,7 +12969,7 @@
     </w:r>
     <w:r>
       <w:rPr/>
-      <w:t>53</w:t>
+      <w:t>58</w:t>
     </w:r>
     <w:r>
       <w:rPr/>

</xml_diff>